<commit_message>
Replace resume with editable mobile-compatible DOCX
</commit_message>
<xml_diff>
--- a/assets/resume/赵亚杰-两年经验-AI产品经理.docx
+++ b/assets/resume/赵亚杰-两年经验-AI产品经理.docx
@@ -2,50 +2,3123 @@
 <file path=word/document.xml><?xml version="1.0" encoding="utf-8"?>
 <w:document xmlns:wpc="http://schemas.microsoft.com/office/word/2010/wordprocessingCanvas" xmlns:mo="http://schemas.microsoft.com/office/mac/office/2008/main" xmlns:mc="http://schemas.openxmlformats.org/markup-compatibility/2006" xmlns:mv="urn:schemas-microsoft-com:mac:vml" xmlns:o="urn:schemas-microsoft-com:office:office" xmlns:r="http://schemas.openxmlformats.org/officeDocument/2006/relationships" xmlns:m="http://schemas.openxmlformats.org/officeDocument/2006/math" xmlns:v="urn:schemas-microsoft-com:vml" xmlns:wp14="http://schemas.microsoft.com/office/word/2010/wordprocessingDrawing" xmlns:wp="http://schemas.openxmlformats.org/drawingml/2006/wordprocessingDrawing" xmlns:w10="urn:schemas-microsoft-com:office:word" xmlns:w="http://schemas.openxmlformats.org/wordprocessingml/2006/main" xmlns:w14="http://schemas.microsoft.com/office/word/2010/wordml" xmlns:wpg="http://schemas.microsoft.com/office/word/2010/wordprocessingGroup" xmlns:wpi="http://schemas.microsoft.com/office/word/2010/wordprocessingInk" xmlns:wne="http://schemas.microsoft.com/office/word/2006/wordml" xmlns:wps="http://schemas.microsoft.com/office/word/2010/wordprocessingShape" mc:Ignorable="w14 wp14">
   <w:body>
+    <w:tbl>
+      <w:tblPr>
+        <w:tblW w:type="auto" w:w="0"/>
+        <w:jc w:val="center"/>
+        <w:tblLayout w:type="fixed"/>
+        <w:tblLook w:firstColumn="1" w:firstRow="1" w:lastColumn="0" w:lastRow="0" w:noHBand="0" w:noVBand="1" w:val="04A0"/>
+      </w:tblPr>
+      <w:tblGrid>
+        <w:gridCol w:w="2438"/>
+        <w:gridCol w:w="8107"/>
+      </w:tblGrid>
+      <w:tr>
+        <w:trPr>
+          <w:trHeight w:val="369" w:hRule="atLeast"/>
+          <w:cantSplit/>
+        </w:trPr>
+        <w:tc>
+          <w:tcPr>
+            <w:tcW w:type="dxa" w:w="2438"/>
+            <w:vAlign w:val="center"/>
+            <w:tcMar>
+              <w:top w:w="23" w:type="dxa"/>
+              <w:start w:w="125" w:type="dxa"/>
+              <w:bottom w:w="14" w:type="dxa"/>
+              <w:end w:w="28" w:type="dxa"/>
+            </w:tcMar>
+            <w:tcBorders>
+              <w:top w:val="nil"/>
+              <w:left w:val="nil"/>
+              <w:bottom w:val="single" w:sz="12" w:color="609EF3"/>
+              <w:right w:val="nil"/>
+              <w:insideH w:val="nil"/>
+              <w:insideV w:val="nil"/>
+            </w:tcBorders>
+            <w:shd w:fill="609EF3" w:val="clear"/>
+          </w:tcPr>
+          <w:p>
+            <w:pPr>
+              <w:keepNext w:val="0"/>
+              <w:keepLines/>
+              <w:widowControl w:val="0"/>
+              <w:spacing w:before="0" w:after="0" w:lineRule="exact" w:line="230"/>
+              <w:ind w:left="0" w:right="0"/>
+              <w:jc w:val="left"/>
+            </w:pPr>
+            <w:r>
+              <w:rPr>
+                <w:rFonts w:ascii="Arial" w:hAnsi="Arial" w:eastAsia="Microsoft YaHei" w:cs="Arial"/>
+                <w:b/>
+                <w:color w:val="FFFFFF"/>
+                <w:sz w:val="21"/>
+                <w:lang w:val="en-US" w:eastAsia="zh-CN"/>
+              </w:rPr>
+              <w:t>基本信息</w:t>
+            </w:r>
+          </w:p>
+        </w:tc>
+        <w:tc>
+          <w:tcPr>
+            <w:tcW w:type="dxa" w:w="8107"/>
+            <w:vAlign w:val="center"/>
+            <w:tcMar>
+              <w:top w:w="20" w:type="dxa"/>
+              <w:start w:w="37" w:type="dxa"/>
+              <w:bottom w:w="20" w:type="dxa"/>
+              <w:end w:w="37" w:type="dxa"/>
+            </w:tcMar>
+            <w:tcBorders>
+              <w:top w:val="nil"/>
+              <w:left w:val="nil"/>
+              <w:bottom w:val="single" w:sz="12" w:color="609EF3"/>
+              <w:right w:val="nil"/>
+              <w:insideH w:val="nil"/>
+              <w:insideV w:val="nil"/>
+            </w:tcBorders>
+          </w:tcPr>
+          <w:p>
+            <w:pPr>
+              <w:keepNext w:val="0"/>
+              <w:keepLines/>
+              <w:widowControl w:val="0"/>
+              <w:spacing w:before="0" w:after="0" w:lineRule="exact" w:line="20"/>
+              <w:ind w:left="0" w:right="0"/>
+              <w:jc w:val="left"/>
+            </w:pPr>
+          </w:p>
+        </w:tc>
+      </w:tr>
+    </w:tbl>
+    <w:tbl>
+      <w:tblPr>
+        <w:tblW w:type="auto" w:w="0"/>
+        <w:jc w:val="center"/>
+        <w:tblLayout w:type="fixed"/>
+        <w:tblLook w:firstColumn="1" w:firstRow="1" w:lastColumn="0" w:lastRow="0" w:noHBand="0" w:noVBand="1" w:val="04A0"/>
+      </w:tblPr>
+      <w:tblGrid>
+        <w:gridCol w:w="1247"/>
+        <w:gridCol w:w="2778"/>
+        <w:gridCol w:w="1247"/>
+        <w:gridCol w:w="3742"/>
+        <w:gridCol w:w="1531"/>
+      </w:tblGrid>
+      <w:tr>
+        <w:trPr>
+          <w:trHeight w:val="499" w:hRule="atLeast"/>
+          <w:cantSplit/>
+        </w:trPr>
+        <w:tc>
+          <w:tcPr>
+            <w:tcW w:type="dxa" w:w="1247"/>
+            <w:vAlign w:val="center"/>
+            <w:tcMar>
+              <w:top w:w="20" w:type="dxa"/>
+              <w:start w:w="37" w:type="dxa"/>
+              <w:bottom w:w="20" w:type="dxa"/>
+              <w:end w:w="37" w:type="dxa"/>
+            </w:tcMar>
+            <w:tcBorders>
+              <w:top w:val="nil"/>
+              <w:left w:val="nil"/>
+              <w:bottom w:val="nil"/>
+              <w:right w:val="nil"/>
+              <w:insideH w:val="nil"/>
+              <w:insideV w:val="nil"/>
+            </w:tcBorders>
+          </w:tcPr>
+          <w:p>
+            <w:pPr>
+              <w:keepNext w:val="0"/>
+              <w:keepLines/>
+              <w:widowControl w:val="0"/>
+              <w:spacing w:before="0" w:after="0" w:lineRule="exact" w:line="207"/>
+              <w:ind w:left="0" w:right="0"/>
+              <w:jc w:val="left"/>
+            </w:pPr>
+            <w:r>
+              <w:rPr>
+                <w:rFonts w:ascii="Arial" w:hAnsi="Arial" w:eastAsia="Microsoft YaHei" w:cs="Arial"/>
+                <w:b/>
+                <w:color w:val="555555"/>
+                <w:sz w:val="17"/>
+                <w:lang w:val="en-US" w:eastAsia="zh-CN"/>
+              </w:rPr>
+              <w:t>姓　　名：</w:t>
+            </w:r>
+          </w:p>
+        </w:tc>
+        <w:tc>
+          <w:tcPr>
+            <w:tcW w:type="dxa" w:w="2778"/>
+            <w:vAlign w:val="center"/>
+            <w:tcMar>
+              <w:top w:w="20" w:type="dxa"/>
+              <w:start w:w="37" w:type="dxa"/>
+              <w:bottom w:w="20" w:type="dxa"/>
+              <w:end w:w="37" w:type="dxa"/>
+            </w:tcMar>
+            <w:tcBorders>
+              <w:top w:val="nil"/>
+              <w:left w:val="nil"/>
+              <w:bottom w:val="nil"/>
+              <w:right w:val="nil"/>
+              <w:insideH w:val="nil"/>
+              <w:insideV w:val="nil"/>
+            </w:tcBorders>
+          </w:tcPr>
+          <w:p>
+            <w:pPr>
+              <w:keepNext w:val="0"/>
+              <w:keepLines/>
+              <w:widowControl w:val="0"/>
+              <w:spacing w:before="0" w:after="0" w:lineRule="exact" w:line="212"/>
+              <w:ind w:left="0" w:right="0"/>
+              <w:jc w:val="left"/>
+            </w:pPr>
+            <w:r>
+              <w:rPr>
+                <w:rFonts w:ascii="Arial" w:hAnsi="Arial" w:eastAsia="Microsoft YaHei" w:cs="Arial"/>
+                <w:b w:val="0"/>
+                <w:color w:val="555555"/>
+                <w:sz w:val="18"/>
+                <w:lang w:val="en-US" w:eastAsia="zh-CN"/>
+              </w:rPr>
+              <w:t>赵亚杰</w:t>
+            </w:r>
+          </w:p>
+        </w:tc>
+        <w:tc>
+          <w:tcPr>
+            <w:tcW w:type="dxa" w:w="1247"/>
+            <w:vAlign w:val="center"/>
+            <w:tcMar>
+              <w:top w:w="20" w:type="dxa"/>
+              <w:start w:w="37" w:type="dxa"/>
+              <w:bottom w:w="20" w:type="dxa"/>
+              <w:end w:w="37" w:type="dxa"/>
+            </w:tcMar>
+            <w:tcBorders>
+              <w:top w:val="nil"/>
+              <w:left w:val="nil"/>
+              <w:bottom w:val="nil"/>
+              <w:right w:val="nil"/>
+              <w:insideH w:val="nil"/>
+              <w:insideV w:val="nil"/>
+            </w:tcBorders>
+          </w:tcPr>
+          <w:p>
+            <w:pPr>
+              <w:keepNext w:val="0"/>
+              <w:keepLines/>
+              <w:widowControl w:val="0"/>
+              <w:spacing w:before="0" w:after="0" w:lineRule="exact" w:line="207"/>
+              <w:ind w:left="0" w:right="0"/>
+              <w:jc w:val="left"/>
+            </w:pPr>
+            <w:r>
+              <w:rPr>
+                <w:rFonts w:ascii="Arial" w:hAnsi="Arial" w:eastAsia="Microsoft YaHei" w:cs="Arial"/>
+                <w:b/>
+                <w:color w:val="555555"/>
+                <w:sz w:val="17"/>
+                <w:lang w:val="en-US" w:eastAsia="zh-CN"/>
+              </w:rPr>
+              <w:t>工作年限：</w:t>
+            </w:r>
+          </w:p>
+        </w:tc>
+        <w:tc>
+          <w:tcPr>
+            <w:tcW w:type="dxa" w:w="3742"/>
+            <w:vAlign w:val="center"/>
+            <w:tcMar>
+              <w:top w:w="20" w:type="dxa"/>
+              <w:start w:w="37" w:type="dxa"/>
+              <w:bottom w:w="20" w:type="dxa"/>
+              <w:end w:w="37" w:type="dxa"/>
+            </w:tcMar>
+            <w:tcBorders>
+              <w:top w:val="nil"/>
+              <w:left w:val="nil"/>
+              <w:bottom w:val="nil"/>
+              <w:right w:val="nil"/>
+              <w:insideH w:val="nil"/>
+              <w:insideV w:val="nil"/>
+            </w:tcBorders>
+          </w:tcPr>
+          <w:p>
+            <w:pPr>
+              <w:keepNext w:val="0"/>
+              <w:keepLines/>
+              <w:widowControl w:val="0"/>
+              <w:spacing w:before="0" w:after="0" w:lineRule="exact" w:line="212"/>
+              <w:ind w:left="0" w:right="0"/>
+              <w:jc w:val="left"/>
+            </w:pPr>
+            <w:r>
+              <w:rPr>
+                <w:rFonts w:ascii="Arial" w:hAnsi="Arial" w:eastAsia="Microsoft YaHei" w:cs="Arial"/>
+                <w:b w:val="0"/>
+                <w:color w:val="555555"/>
+                <w:sz w:val="18"/>
+                <w:lang w:val="en-US" w:eastAsia="zh-CN"/>
+              </w:rPr>
+              <w:t>2年经验</w:t>
+            </w:r>
+          </w:p>
+        </w:tc>
+        <w:tc>
+          <w:tcPr>
+            <w:tcW w:type="dxa" w:w="1531"/>
+            <w:vAlign w:val="center"/>
+            <w:tcMar>
+              <w:top w:w="23" w:type="dxa"/>
+              <w:start w:w="57" w:type="dxa"/>
+              <w:bottom w:w="23" w:type="dxa"/>
+              <w:end w:w="11" w:type="dxa"/>
+            </w:tcMar>
+            <w:vMerge w:val="restart"/>
+            <w:tcBorders>
+              <w:top w:val="nil"/>
+              <w:left w:val="nil"/>
+              <w:bottom w:val="nil"/>
+              <w:right w:val="nil"/>
+              <w:insideH w:val="nil"/>
+              <w:insideV w:val="nil"/>
+            </w:tcBorders>
+          </w:tcPr>
+          <w:p>
+            <w:pPr>
+              <w:keepLines/>
+              <w:widowControl w:val="0"/>
+              <w:spacing w:before="0" w:after="0" w:lineRule="atLeast" w:line="1520"/>
+              <w:jc w:val="center"/>
+            </w:pPr>
+            <w:r>
+              <w:drawing>
+                <wp:inline xmlns:a="http://schemas.openxmlformats.org/drawingml/2006/main" xmlns:pic="http://schemas.openxmlformats.org/drawingml/2006/picture">
+                  <wp:extent cx="802286" cy="936000"/>
+                  <wp:docPr id="1" name="Picture 1"/>
+                  <wp:cNvGraphicFramePr>
+                    <a:graphicFrameLocks noChangeAspect="1"/>
+                  </wp:cNvGraphicFramePr>
+                  <a:graphic>
+                    <a:graphicData uri="http://schemas.openxmlformats.org/drawingml/2006/picture">
+                      <pic:pic>
+                        <pic:nvPicPr>
+                          <pic:cNvPr id="0" name="portrait_zhao_yajie.jpg"/>
+                          <pic:cNvPicPr/>
+                        </pic:nvPicPr>
+                        <pic:blipFill>
+                          <a:blip r:embed="rId10"/>
+                          <a:stretch>
+                            <a:fillRect/>
+                          </a:stretch>
+                        </pic:blipFill>
+                        <pic:spPr>
+                          <a:xfrm>
+                            <a:off x="0" y="0"/>
+                            <a:ext cx="802286" cy="936000"/>
+                          </a:xfrm>
+                          <a:prstGeom prst="rect"/>
+                        </pic:spPr>
+                      </pic:pic>
+                    </a:graphicData>
+                  </a:graphic>
+                </wp:inline>
+              </w:drawing>
+            </w:r>
+          </w:p>
+        </w:tc>
+      </w:tr>
+      <w:tr>
+        <w:trPr>
+          <w:trHeight w:val="499" w:hRule="atLeast"/>
+          <w:cantSplit/>
+        </w:trPr>
+        <w:tc>
+          <w:tcPr>
+            <w:tcW w:type="dxa" w:w="1247"/>
+            <w:vAlign w:val="center"/>
+            <w:tcMar>
+              <w:top w:w="20" w:type="dxa"/>
+              <w:start w:w="37" w:type="dxa"/>
+              <w:bottom w:w="20" w:type="dxa"/>
+              <w:end w:w="37" w:type="dxa"/>
+            </w:tcMar>
+            <w:tcBorders>
+              <w:top w:val="nil"/>
+              <w:left w:val="nil"/>
+              <w:bottom w:val="nil"/>
+              <w:right w:val="nil"/>
+              <w:insideH w:val="nil"/>
+              <w:insideV w:val="nil"/>
+            </w:tcBorders>
+          </w:tcPr>
+          <w:p>
+            <w:pPr>
+              <w:keepNext w:val="0"/>
+              <w:keepLines/>
+              <w:widowControl w:val="0"/>
+              <w:spacing w:before="0" w:after="0" w:lineRule="exact" w:line="207"/>
+              <w:ind w:left="0" w:right="0"/>
+              <w:jc w:val="left"/>
+            </w:pPr>
+            <w:r>
+              <w:rPr>
+                <w:rFonts w:ascii="Arial" w:hAnsi="Arial" w:eastAsia="Microsoft YaHei" w:cs="Arial"/>
+                <w:b/>
+                <w:color w:val="555555"/>
+                <w:sz w:val="17"/>
+                <w:lang w:val="en-US" w:eastAsia="zh-CN"/>
+              </w:rPr>
+              <w:t>电　　话：</w:t>
+            </w:r>
+          </w:p>
+        </w:tc>
+        <w:tc>
+          <w:tcPr>
+            <w:tcW w:type="dxa" w:w="2778"/>
+            <w:vAlign w:val="center"/>
+            <w:tcMar>
+              <w:top w:w="20" w:type="dxa"/>
+              <w:start w:w="37" w:type="dxa"/>
+              <w:bottom w:w="20" w:type="dxa"/>
+              <w:end w:w="37" w:type="dxa"/>
+            </w:tcMar>
+            <w:tcBorders>
+              <w:top w:val="nil"/>
+              <w:left w:val="nil"/>
+              <w:bottom w:val="nil"/>
+              <w:right w:val="nil"/>
+              <w:insideH w:val="nil"/>
+              <w:insideV w:val="nil"/>
+            </w:tcBorders>
+          </w:tcPr>
+          <w:p>
+            <w:pPr>
+              <w:keepNext w:val="0"/>
+              <w:keepLines/>
+              <w:widowControl w:val="0"/>
+              <w:spacing w:before="0" w:after="0" w:lineRule="exact" w:line="212"/>
+              <w:ind w:left="0" w:right="0"/>
+              <w:jc w:val="left"/>
+            </w:pPr>
+            <w:r>
+              <w:rPr>
+                <w:rFonts w:ascii="Arial" w:hAnsi="Arial" w:eastAsia="Microsoft YaHei" w:cs="Arial"/>
+                <w:b w:val="0"/>
+                <w:color w:val="555555"/>
+                <w:sz w:val="18"/>
+                <w:lang w:val="en-US" w:eastAsia="zh-CN"/>
+              </w:rPr>
+              <w:t>17855772097</w:t>
+            </w:r>
+          </w:p>
+        </w:tc>
+        <w:tc>
+          <w:tcPr>
+            <w:tcW w:type="dxa" w:w="1247"/>
+            <w:vAlign w:val="center"/>
+            <w:tcMar>
+              <w:top w:w="20" w:type="dxa"/>
+              <w:start w:w="37" w:type="dxa"/>
+              <w:bottom w:w="20" w:type="dxa"/>
+              <w:end w:w="37" w:type="dxa"/>
+            </w:tcMar>
+            <w:tcBorders>
+              <w:top w:val="nil"/>
+              <w:left w:val="nil"/>
+              <w:bottom w:val="nil"/>
+              <w:right w:val="nil"/>
+              <w:insideH w:val="nil"/>
+              <w:insideV w:val="nil"/>
+            </w:tcBorders>
+          </w:tcPr>
+          <w:p>
+            <w:pPr>
+              <w:keepNext w:val="0"/>
+              <w:keepLines/>
+              <w:widowControl w:val="0"/>
+              <w:spacing w:before="0" w:after="0" w:lineRule="exact" w:line="207"/>
+              <w:ind w:left="0" w:right="0"/>
+              <w:jc w:val="left"/>
+            </w:pPr>
+            <w:r>
+              <w:rPr>
+                <w:rFonts w:ascii="Arial" w:hAnsi="Arial" w:eastAsia="Microsoft YaHei" w:cs="Arial"/>
+                <w:b/>
+                <w:color w:val="555555"/>
+                <w:sz w:val="17"/>
+                <w:lang w:val="en-US" w:eastAsia="zh-CN"/>
+              </w:rPr>
+              <w:t>邮　　箱：</w:t>
+            </w:r>
+          </w:p>
+        </w:tc>
+        <w:tc>
+          <w:tcPr>
+            <w:tcW w:type="dxa" w:w="3742"/>
+            <w:vAlign w:val="center"/>
+            <w:tcMar>
+              <w:top w:w="20" w:type="dxa"/>
+              <w:start w:w="37" w:type="dxa"/>
+              <w:bottom w:w="20" w:type="dxa"/>
+              <w:end w:w="37" w:type="dxa"/>
+            </w:tcMar>
+            <w:tcBorders>
+              <w:top w:val="nil"/>
+              <w:left w:val="nil"/>
+              <w:bottom w:val="nil"/>
+              <w:right w:val="nil"/>
+              <w:insideH w:val="nil"/>
+              <w:insideV w:val="nil"/>
+            </w:tcBorders>
+          </w:tcPr>
+          <w:p>
+            <w:pPr>
+              <w:keepNext w:val="0"/>
+              <w:keepLines/>
+              <w:widowControl w:val="0"/>
+              <w:spacing w:before="0" w:after="0" w:lineRule="exact" w:line="199"/>
+              <w:ind w:left="0" w:right="0"/>
+              <w:jc w:val="left"/>
+            </w:pPr>
+            <w:r>
+              <w:rPr>
+                <w:rFonts w:ascii="Arial" w:hAnsi="Arial" w:eastAsia="Microsoft YaHei" w:cs="Arial"/>
+                <w:b w:val="0"/>
+                <w:color w:val="555555"/>
+                <w:sz w:val="16"/>
+                <w:lang w:val="en-US" w:eastAsia="zh-CN"/>
+              </w:rPr>
+              <w:t>m19323067704@163.com</w:t>
+            </w:r>
+          </w:p>
+        </w:tc>
+        <w:tc>
+          <w:tcPr>
+            <w:tcW w:type="dxa" w:w="1531"/>
+            <w:vAlign w:val="center"/>
+            <w:tcMar>
+              <w:top w:w="20" w:type="dxa"/>
+              <w:start w:w="37" w:type="dxa"/>
+              <w:bottom w:w="20" w:type="dxa"/>
+              <w:end w:w="37" w:type="dxa"/>
+            </w:tcMar>
+            <w:vMerge/>
+            <w:tcBorders>
+              <w:top w:val="nil"/>
+              <w:left w:val="nil"/>
+              <w:bottom w:val="nil"/>
+              <w:right w:val="nil"/>
+              <w:insideH w:val="nil"/>
+              <w:insideV w:val="nil"/>
+            </w:tcBorders>
+          </w:tcPr>
+          <w:p/>
+        </w:tc>
+      </w:tr>
+      <w:tr>
+        <w:trPr>
+          <w:trHeight w:val="499" w:hRule="atLeast"/>
+          <w:cantSplit/>
+        </w:trPr>
+        <w:tc>
+          <w:tcPr>
+            <w:tcW w:type="dxa" w:w="4025"/>
+            <w:vAlign w:val="center"/>
+            <w:tcMar>
+              <w:top w:w="20" w:type="dxa"/>
+              <w:start w:w="37" w:type="dxa"/>
+              <w:bottom w:w="20" w:type="dxa"/>
+              <w:end w:w="37" w:type="dxa"/>
+            </w:tcMar>
+            <w:gridSpan w:val="2"/>
+            <w:tcBorders>
+              <w:top w:val="nil"/>
+              <w:left w:val="nil"/>
+              <w:bottom w:val="nil"/>
+              <w:right w:val="nil"/>
+              <w:insideH w:val="nil"/>
+              <w:insideV w:val="nil"/>
+            </w:tcBorders>
+          </w:tcPr>
+          <w:p>
+            <w:pPr>
+              <w:keepNext w:val="0"/>
+              <w:keepLines/>
+              <w:widowControl w:val="0"/>
+              <w:spacing w:before="0" w:after="0" w:lineRule="exact" w:line="204"/>
+              <w:ind w:left="0" w:right="0"/>
+              <w:jc w:val="left"/>
+            </w:pPr>
+            <w:r>
+              <w:rPr>
+                <w:rFonts w:ascii="Arial" w:hAnsi="Arial" w:eastAsia="Microsoft YaHei" w:cs="Arial"/>
+                <w:b/>
+                <w:color w:val="333333"/>
+                <w:sz w:val="16"/>
+                <w:lang w:val="en-US" w:eastAsia="zh-CN"/>
+              </w:rPr>
+              <w:t>个人简历网站：</w:t>
+            </w:r>
+            <w:hyperlink r:id="rId9">
+              <w:r>
+                <w:rPr>
+                  <w:rFonts w:ascii="Arial" w:hAnsi="Arial" w:eastAsia="Microsoft YaHei"/>
+                  <w:color w:val="3876CB"/>
+                  <w:u w:val="single"/>
+                  <w:sz w:val="16"/>
+                  <w:szCs w:val="16"/>
+                </w:rPr>
+                <w:t>https://www.zyjaiproduct.click/</w:t>
+              </w:r>
+            </w:hyperlink>
+          </w:p>
+        </w:tc>
+        <w:tc>
+          <w:tcPr>
+            <w:tcW w:type="dxa" w:w="4989"/>
+            <w:vAlign w:val="center"/>
+            <w:tcMar>
+              <w:top w:w="20" w:type="dxa"/>
+              <w:start w:w="37" w:type="dxa"/>
+              <w:bottom w:w="20" w:type="dxa"/>
+              <w:end w:w="37" w:type="dxa"/>
+            </w:tcMar>
+            <w:gridSpan w:val="2"/>
+            <w:tcBorders>
+              <w:top w:val="nil"/>
+              <w:left w:val="nil"/>
+              <w:bottom w:val="nil"/>
+              <w:right w:val="nil"/>
+              <w:insideH w:val="nil"/>
+              <w:insideV w:val="nil"/>
+            </w:tcBorders>
+          </w:tcPr>
+          <w:p>
+            <w:pPr>
+              <w:keepNext w:val="0"/>
+              <w:keepLines/>
+              <w:widowControl w:val="0"/>
+              <w:spacing w:before="0" w:after="0" w:lineRule="exact" w:line="204"/>
+              <w:ind w:left="0" w:right="0"/>
+              <w:jc w:val="left"/>
+            </w:pPr>
+            <w:r>
+              <w:rPr>
+                <w:rFonts w:ascii="Arial" w:hAnsi="Arial" w:eastAsia="Microsoft YaHei" w:cs="Arial"/>
+                <w:b/>
+                <w:color w:val="333333"/>
+                <w:sz w:val="16"/>
+                <w:lang w:val="en-US" w:eastAsia="zh-CN"/>
+              </w:rPr>
+              <w:t>可实习时长：</w:t>
+            </w:r>
+            <w:r>
+              <w:rPr>
+                <w:rFonts w:ascii="Arial" w:hAnsi="Arial" w:eastAsia="Microsoft YaHei" w:cs="Arial"/>
+                <w:b w:val="0"/>
+                <w:color w:val="555555"/>
+                <w:sz w:val="16"/>
+                <w:lang w:val="en-US" w:eastAsia="zh-CN"/>
+              </w:rPr>
+              <w:t>6个月以上，每周5天,随时到岗</w:t>
+            </w:r>
+          </w:p>
+        </w:tc>
+        <w:tc>
+          <w:tcPr>
+            <w:tcW w:type="dxa" w:w="1531"/>
+            <w:vAlign w:val="center"/>
+            <w:tcMar>
+              <w:top w:w="20" w:type="dxa"/>
+              <w:start w:w="37" w:type="dxa"/>
+              <w:bottom w:w="20" w:type="dxa"/>
+              <w:end w:w="37" w:type="dxa"/>
+            </w:tcMar>
+            <w:vMerge/>
+            <w:tcBorders>
+              <w:top w:val="nil"/>
+              <w:left w:val="nil"/>
+              <w:bottom w:val="nil"/>
+              <w:right w:val="nil"/>
+              <w:insideH w:val="nil"/>
+              <w:insideV w:val="nil"/>
+            </w:tcBorders>
+          </w:tcPr>
+          <w:p/>
+        </w:tc>
+      </w:tr>
+    </w:tbl>
+    <w:tbl>
+      <w:tblPr>
+        <w:tblW w:type="auto" w:w="0"/>
+        <w:jc w:val="center"/>
+        <w:tblLayout w:type="fixed"/>
+        <w:tblLook w:firstColumn="1" w:firstRow="1" w:lastColumn="0" w:lastRow="0" w:noHBand="0" w:noVBand="1" w:val="04A0"/>
+      </w:tblPr>
+      <w:tblGrid>
+        <w:gridCol w:w="2438"/>
+        <w:gridCol w:w="8107"/>
+      </w:tblGrid>
+      <w:tr>
+        <w:trPr>
+          <w:trHeight w:val="369" w:hRule="atLeast"/>
+          <w:cantSplit/>
+        </w:trPr>
+        <w:tc>
+          <w:tcPr>
+            <w:tcW w:type="dxa" w:w="2438"/>
+            <w:vAlign w:val="center"/>
+            <w:tcMar>
+              <w:top w:w="23" w:type="dxa"/>
+              <w:start w:w="125" w:type="dxa"/>
+              <w:bottom w:w="14" w:type="dxa"/>
+              <w:end w:w="28" w:type="dxa"/>
+            </w:tcMar>
+            <w:tcBorders>
+              <w:top w:val="nil"/>
+              <w:left w:val="nil"/>
+              <w:bottom w:val="single" w:sz="12" w:color="609EF3"/>
+              <w:right w:val="nil"/>
+              <w:insideH w:val="nil"/>
+              <w:insideV w:val="nil"/>
+            </w:tcBorders>
+            <w:shd w:fill="609EF3" w:val="clear"/>
+          </w:tcPr>
+          <w:p>
+            <w:pPr>
+              <w:keepNext w:val="0"/>
+              <w:keepLines/>
+              <w:widowControl w:val="0"/>
+              <w:spacing w:before="0" w:after="0" w:lineRule="exact" w:line="230"/>
+              <w:ind w:left="0" w:right="0"/>
+              <w:jc w:val="left"/>
+            </w:pPr>
+            <w:r>
+              <w:rPr>
+                <w:rFonts w:ascii="Arial" w:hAnsi="Arial" w:eastAsia="Microsoft YaHei" w:cs="Arial"/>
+                <w:b/>
+                <w:color w:val="FFFFFF"/>
+                <w:sz w:val="21"/>
+                <w:lang w:val="en-US" w:eastAsia="zh-CN"/>
+              </w:rPr>
+              <w:t>实习经历(三段)</w:t>
+            </w:r>
+          </w:p>
+        </w:tc>
+        <w:tc>
+          <w:tcPr>
+            <w:tcW w:type="dxa" w:w="8107"/>
+            <w:vAlign w:val="center"/>
+            <w:tcMar>
+              <w:top w:w="20" w:type="dxa"/>
+              <w:start w:w="37" w:type="dxa"/>
+              <w:bottom w:w="20" w:type="dxa"/>
+              <w:end w:w="37" w:type="dxa"/>
+            </w:tcMar>
+            <w:tcBorders>
+              <w:top w:val="nil"/>
+              <w:left w:val="nil"/>
+              <w:bottom w:val="single" w:sz="12" w:color="609EF3"/>
+              <w:right w:val="nil"/>
+              <w:insideH w:val="nil"/>
+              <w:insideV w:val="nil"/>
+            </w:tcBorders>
+          </w:tcPr>
+          <w:p>
+            <w:pPr>
+              <w:keepNext w:val="0"/>
+              <w:keepLines/>
+              <w:widowControl w:val="0"/>
+              <w:spacing w:before="0" w:after="0" w:lineRule="exact" w:line="20"/>
+              <w:ind w:left="0" w:right="0"/>
+              <w:jc w:val="left"/>
+            </w:pPr>
+          </w:p>
+        </w:tc>
+      </w:tr>
+    </w:tbl>
+    <w:tbl>
+      <w:tblPr>
+        <w:tblW w:type="auto" w:w="0"/>
+        <w:jc w:val="center"/>
+        <w:tblLayout w:type="fixed"/>
+        <w:tblLook w:firstColumn="1" w:firstRow="1" w:lastColumn="0" w:lastRow="0" w:noHBand="0" w:noVBand="1" w:val="04A0"/>
+      </w:tblPr>
+      <w:tblGrid>
+        <w:gridCol w:w="2211"/>
+        <w:gridCol w:w="4649"/>
+        <w:gridCol w:w="510"/>
+        <w:gridCol w:w="3175"/>
+      </w:tblGrid>
+      <w:tr>
+        <w:trPr>
+          <w:trHeight w:val="431" w:hRule="atLeast"/>
+          <w:cantSplit/>
+        </w:trPr>
+        <w:tc>
+          <w:tcPr>
+            <w:tcW w:type="dxa" w:w="2211"/>
+            <w:vAlign w:val="center"/>
+            <w:tcMar>
+              <w:top w:w="20" w:type="dxa"/>
+              <w:start w:w="37" w:type="dxa"/>
+              <w:bottom w:w="20" w:type="dxa"/>
+              <w:end w:w="37" w:type="dxa"/>
+            </w:tcMar>
+            <w:tcBorders>
+              <w:top w:val="nil"/>
+              <w:left w:val="nil"/>
+              <w:bottom w:val="nil"/>
+              <w:right w:val="nil"/>
+              <w:insideH w:val="nil"/>
+              <w:insideV w:val="nil"/>
+            </w:tcBorders>
+          </w:tcPr>
+          <w:p>
+            <w:pPr>
+              <w:keepNext w:val="0"/>
+              <w:keepLines/>
+              <w:widowControl w:val="0"/>
+              <w:spacing w:before="0" w:after="0" w:lineRule="exact" w:line="212"/>
+              <w:ind w:left="0" w:right="0"/>
+              <w:jc w:val="left"/>
+            </w:pPr>
+            <w:r>
+              <w:rPr>
+                <w:rFonts w:ascii="Arial" w:hAnsi="Arial" w:eastAsia="Microsoft YaHei" w:cs="Arial"/>
+                <w:b w:val="0"/>
+                <w:color w:val="555555"/>
+                <w:sz w:val="18"/>
+                <w:lang w:val="en-US" w:eastAsia="zh-CN"/>
+              </w:rPr>
+              <w:t>2026-03 ~ 2026-09</w:t>
+            </w:r>
+          </w:p>
+        </w:tc>
+        <w:tc>
+          <w:tcPr>
+            <w:tcW w:type="dxa" w:w="4649"/>
+            <w:vAlign w:val="center"/>
+            <w:tcMar>
+              <w:top w:w="20" w:type="dxa"/>
+              <w:start w:w="37" w:type="dxa"/>
+              <w:bottom w:w="20" w:type="dxa"/>
+              <w:end w:w="37" w:type="dxa"/>
+            </w:tcMar>
+            <w:tcBorders>
+              <w:top w:val="nil"/>
+              <w:left w:val="nil"/>
+              <w:bottom w:val="nil"/>
+              <w:right w:val="nil"/>
+              <w:insideH w:val="nil"/>
+              <w:insideV w:val="nil"/>
+            </w:tcBorders>
+          </w:tcPr>
+          <w:p>
+            <w:pPr>
+              <w:keepNext w:val="0"/>
+              <w:keepLines/>
+              <w:widowControl w:val="0"/>
+              <w:spacing w:before="0" w:after="0" w:lineRule="exact" w:line="219"/>
+              <w:ind w:left="0" w:right="0"/>
+              <w:jc w:val="center"/>
+            </w:pPr>
+            <w:r>
+              <w:rPr>
+                <w:rFonts w:ascii="Arial" w:hAnsi="Arial" w:eastAsia="Microsoft YaHei" w:cs="Arial"/>
+                <w:b/>
+                <w:color w:val="333333"/>
+                <w:sz w:val="18"/>
+                <w:lang w:val="en-US" w:eastAsia="zh-CN"/>
+              </w:rPr>
+              <w:t>上海环内圈网络科技有限公司</w:t>
+            </w:r>
+          </w:p>
+        </w:tc>
+        <w:tc>
+          <w:tcPr>
+            <w:tcW w:type="dxa" w:w="510"/>
+            <w:vAlign w:val="center"/>
+            <w:tcMar>
+              <w:top w:w="20" w:type="dxa"/>
+              <w:start w:w="37" w:type="dxa"/>
+              <w:bottom w:w="20" w:type="dxa"/>
+              <w:end w:w="37" w:type="dxa"/>
+            </w:tcMar>
+            <w:tcBorders>
+              <w:top w:val="nil"/>
+              <w:left w:val="nil"/>
+              <w:bottom w:val="nil"/>
+              <w:right w:val="nil"/>
+              <w:insideH w:val="nil"/>
+              <w:insideV w:val="nil"/>
+            </w:tcBorders>
+          </w:tcPr>
+          <w:p>
+            <w:pPr>
+              <w:keepLines/>
+              <w:widowControl w:val="0"/>
+              <w:spacing w:before="0" w:after="0" w:lineRule="atLeast" w:line="420"/>
+              <w:jc w:val="center"/>
+            </w:pPr>
+            <w:r>
+              <w:drawing>
+                <wp:inline xmlns:a="http://schemas.openxmlformats.org/drawingml/2006/main" xmlns:pic="http://schemas.openxmlformats.org/drawingml/2006/picture">
+                  <wp:extent cx="240727" cy="252000"/>
+                  <wp:docPr id="2" name="Picture 2"/>
+                  <wp:cNvGraphicFramePr>
+                    <a:graphicFrameLocks noChangeAspect="1"/>
+                  </wp:cNvGraphicFramePr>
+                  <a:graphic>
+                    <a:graphicData uri="http://schemas.openxmlformats.org/drawingml/2006/picture">
+                      <pic:pic>
+                        <pic:nvPicPr>
+                          <pic:cNvPr id="0" name="logo_huannaiquan.jpg"/>
+                          <pic:cNvPicPr/>
+                        </pic:nvPicPr>
+                        <pic:blipFill>
+                          <a:blip r:embed="rId11"/>
+                          <a:stretch>
+                            <a:fillRect/>
+                          </a:stretch>
+                        </pic:blipFill>
+                        <pic:spPr>
+                          <a:xfrm>
+                            <a:off x="0" y="0"/>
+                            <a:ext cx="240727" cy="252000"/>
+                          </a:xfrm>
+                          <a:prstGeom prst="rect"/>
+                        </pic:spPr>
+                      </pic:pic>
+                    </a:graphicData>
+                  </a:graphic>
+                </wp:inline>
+              </w:drawing>
+            </w:r>
+          </w:p>
+        </w:tc>
+        <w:tc>
+          <w:tcPr>
+            <w:tcW w:type="dxa" w:w="3175"/>
+            <w:vAlign w:val="center"/>
+            <w:tcMar>
+              <w:top w:w="20" w:type="dxa"/>
+              <w:start w:w="37" w:type="dxa"/>
+              <w:bottom w:w="20" w:type="dxa"/>
+              <w:end w:w="37" w:type="dxa"/>
+            </w:tcMar>
+            <w:tcBorders>
+              <w:top w:val="nil"/>
+              <w:left w:val="nil"/>
+              <w:bottom w:val="nil"/>
+              <w:right w:val="nil"/>
+              <w:insideH w:val="nil"/>
+              <w:insideV w:val="nil"/>
+            </w:tcBorders>
+          </w:tcPr>
+          <w:p>
+            <w:pPr>
+              <w:keepNext w:val="0"/>
+              <w:keepLines/>
+              <w:widowControl w:val="0"/>
+              <w:spacing w:before="0" w:after="0" w:lineRule="exact" w:line="212"/>
+              <w:ind w:left="0" w:right="0"/>
+              <w:jc w:val="right"/>
+            </w:pPr>
+            <w:r>
+              <w:rPr>
+                <w:rFonts w:ascii="Arial" w:hAnsi="Arial" w:eastAsia="Microsoft YaHei" w:cs="Arial"/>
+                <w:b/>
+                <w:color w:val="333333"/>
+                <w:sz w:val="18"/>
+                <w:lang w:val="en-US" w:eastAsia="zh-CN"/>
+              </w:rPr>
+              <w:t>AI产品经理&amp;FDE实习生</w:t>
+            </w:r>
+          </w:p>
+        </w:tc>
+      </w:tr>
+    </w:tbl>
     <w:p>
       <w:pPr>
-        <w:spacing w:before="0" w:after="0"/>
-        <w:ind w:left="0" w:right="0"/>
-        <w:jc w:val="center"/>
+        <w:keepNext/>
+        <w:keepLines/>
+        <w:widowControl w:val="0"/>
+        <w:spacing w:before="15" w:after="0" w:lineRule="exact" w:line="230"/>
+        <w:ind w:left="45" w:right="23"/>
+        <w:jc w:val="left"/>
       </w:pPr>
       <w:r>
-        <w:drawing>
-          <wp:inline xmlns:a="http://schemas.openxmlformats.org/drawingml/2006/main" xmlns:pic="http://schemas.openxmlformats.org/drawingml/2006/picture">
-            <wp:extent cx="7488000" cy="10589336"/>
-            <wp:docPr id="1" name="赵亚杰-两年经验-AI产品经理简历" descr="赵亚杰-两年经验-AI产品经理简历完整页面"/>
-            <wp:cNvGraphicFramePr>
-              <a:graphicFrameLocks noChangeAspect="1"/>
-            </wp:cNvGraphicFramePr>
-            <a:graphic>
-              <a:graphicData uri="http://schemas.openxmlformats.org/drawingml/2006/picture">
-                <pic:pic>
-                  <pic:nvPicPr>
-                    <pic:cNvPr id="0" name="resume-source.png"/>
-                    <pic:cNvPicPr/>
-                  </pic:nvPicPr>
-                  <pic:blipFill>
-                    <a:blip r:embed="rId9"/>
-                    <a:stretch>
-                      <a:fillRect/>
-                    </a:stretch>
-                  </pic:blipFill>
-                  <pic:spPr>
-                    <a:xfrm>
-                      <a:off x="0" y="0"/>
-                      <a:ext cx="7488000" cy="10589336"/>
-                    </a:xfrm>
-                    <a:prstGeom prst="rect"/>
-                  </pic:spPr>
-                </pic:pic>
-              </a:graphicData>
-            </a:graphic>
-          </wp:inline>
-        </w:drawing>
+        <w:rPr>
+          <w:rFonts w:ascii="Arial" w:hAnsi="Arial" w:eastAsia="Microsoft YaHei" w:cs="Arial"/>
+          <w:b/>
+          <w:color w:val="333333"/>
+          <w:sz w:val="18"/>
+          <w:lang w:val="en-US" w:eastAsia="zh-CN"/>
+        </w:rPr>
+        <w:t>一、“赛博女娲“功能迭代和优化</w:t>
+      </w:r>
+    </w:p>
+    <w:p>
+      <w:pPr>
+        <w:keepNext w:val="0"/>
+        <w:keepLines/>
+        <w:widowControl w:val="0"/>
+        <w:spacing w:before="0" w:after="0" w:lineRule="exact" w:line="224"/>
+        <w:ind w:left="45" w:right="23"/>
+        <w:jc w:val="left"/>
+      </w:pPr>
+      <w:r>
+        <w:rPr>
+          <w:rFonts w:ascii="Arial" w:hAnsi="Arial" w:eastAsia="Microsoft YaHei" w:cs="Arial"/>
+          <w:b/>
+          <w:color w:val="333333"/>
+          <w:sz w:val="18"/>
+          <w:lang w:val="en-US" w:eastAsia="zh-CN"/>
+        </w:rPr>
+        <w:t>1.Skill封装：</w:t>
+      </w:r>
+      <w:r>
+        <w:rPr>
+          <w:rFonts w:ascii="Arial" w:hAnsi="Arial" w:eastAsia="Microsoft YaHei" w:cs="Arial"/>
+          <w:b w:val="0"/>
+          <w:color w:val="555555"/>
+          <w:sz w:val="18"/>
+          <w:lang w:val="en-US" w:eastAsia="zh-CN"/>
+        </w:rPr>
+        <w:t>完成桌面端操作、网页端操作、API调用、GitHub项目</w:t>
+      </w:r>
+      <w:r>
+        <w:rPr>
+          <w:rFonts w:ascii="Arial" w:hAnsi="Arial" w:eastAsia="Microsoft YaHei" w:cs="Arial"/>
+          <w:b/>
+          <w:color w:val="333333"/>
+          <w:sz w:val="18"/>
+          <w:lang w:val="en-US" w:eastAsia="zh-CN"/>
+        </w:rPr>
+        <w:t>四类Skill封装</w:t>
+      </w:r>
+      <w:r>
+        <w:rPr>
+          <w:rFonts w:ascii="Arial" w:hAnsi="Arial" w:eastAsia="Microsoft YaHei" w:cs="Arial"/>
+          <w:b w:val="0"/>
+          <w:color w:val="555555"/>
+          <w:sz w:val="18"/>
+          <w:lang w:val="en-US" w:eastAsia="zh-CN"/>
+        </w:rPr>
+        <w:t>，累计沉淀</w:t>
+      </w:r>
+      <w:r>
+        <w:rPr>
+          <w:rFonts w:ascii="Arial" w:hAnsi="Arial" w:eastAsia="Microsoft YaHei" w:cs="Arial"/>
+          <w:b/>
+          <w:color w:val="333333"/>
+          <w:sz w:val="18"/>
+          <w:lang w:val="en-US" w:eastAsia="zh-CN"/>
+        </w:rPr>
+        <w:t>20+个技能模块</w:t>
+      </w:r>
+    </w:p>
+    <w:p>
+      <w:pPr>
+        <w:keepNext w:val="0"/>
+        <w:keepLines/>
+        <w:widowControl w:val="0"/>
+        <w:spacing w:before="0" w:after="0" w:lineRule="exact" w:line="224"/>
+        <w:ind w:left="45" w:right="23"/>
+        <w:jc w:val="left"/>
+      </w:pPr>
+      <w:r>
+        <w:rPr>
+          <w:rFonts w:ascii="Arial" w:hAnsi="Arial" w:eastAsia="Microsoft YaHei" w:cs="Arial"/>
+          <w:b/>
+          <w:color w:val="333333"/>
+          <w:sz w:val="18"/>
+          <w:lang w:val="en-US" w:eastAsia="zh-CN"/>
+        </w:rPr>
+        <w:t>2.任务看板设计：</w:t>
+      </w:r>
+      <w:r>
+        <w:rPr>
+          <w:rFonts w:ascii="Arial" w:hAnsi="Arial" w:eastAsia="Microsoft YaHei" w:cs="Arial"/>
+          <w:b w:val="0"/>
+          <w:color w:val="555555"/>
+          <w:sz w:val="18"/>
+          <w:lang w:val="en-US" w:eastAsia="zh-CN"/>
+        </w:rPr>
+        <w:t>设计</w:t>
+      </w:r>
+      <w:r>
+        <w:rPr>
+          <w:rFonts w:ascii="Arial" w:hAnsi="Arial" w:eastAsia="Microsoft YaHei" w:cs="Arial"/>
+          <w:b/>
+          <w:color w:val="333333"/>
+          <w:sz w:val="18"/>
+          <w:lang w:val="en-US" w:eastAsia="zh-CN"/>
+        </w:rPr>
+        <w:t>Agent任务执行看板</w:t>
+      </w:r>
+      <w:r>
+        <w:rPr>
+          <w:rFonts w:ascii="Arial" w:hAnsi="Arial" w:eastAsia="Microsoft YaHei" w:cs="Arial"/>
+          <w:b w:val="0"/>
+          <w:color w:val="555555"/>
+          <w:sz w:val="18"/>
+          <w:lang w:val="en-US" w:eastAsia="zh-CN"/>
+        </w:rPr>
+        <w:t>，覆盖任务输入、执行过程、结果输出全链路展示，</w:t>
+      </w:r>
+      <w:r>
+        <w:rPr>
+          <w:rFonts w:ascii="Arial" w:hAnsi="Arial" w:eastAsia="Microsoft YaHei" w:cs="Arial"/>
+          <w:b/>
+          <w:color w:val="333333"/>
+          <w:sz w:val="18"/>
+          <w:lang w:val="en-US" w:eastAsia="zh-CN"/>
+        </w:rPr>
+        <w:t>提升产品可视化体验</w:t>
+      </w:r>
+    </w:p>
+    <w:p>
+      <w:pPr>
+        <w:keepNext w:val="0"/>
+        <w:keepLines/>
+        <w:widowControl w:val="0"/>
+        <w:spacing w:before="0" w:after="0" w:lineRule="exact" w:line="224"/>
+        <w:ind w:left="45" w:right="23"/>
+        <w:jc w:val="left"/>
+      </w:pPr>
+      <w:r>
+        <w:rPr>
+          <w:rFonts w:ascii="Arial" w:hAnsi="Arial" w:eastAsia="Microsoft YaHei" w:cs="Arial"/>
+          <w:b/>
+          <w:color w:val="333333"/>
+          <w:sz w:val="18"/>
+          <w:lang w:val="en-US" w:eastAsia="zh-CN"/>
+        </w:rPr>
+        <w:t>3.产品赋能：</w:t>
+      </w:r>
+      <w:r>
+        <w:rPr>
+          <w:rFonts w:ascii="Arial" w:hAnsi="Arial" w:eastAsia="Microsoft YaHei" w:cs="Arial"/>
+          <w:b w:val="0"/>
+          <w:color w:val="555555"/>
+          <w:sz w:val="18"/>
+          <w:lang w:val="en-US" w:eastAsia="zh-CN"/>
+        </w:rPr>
+        <w:t>持续引入市场优秀AI技能方案并</w:t>
+      </w:r>
+      <w:r>
+        <w:rPr>
+          <w:rFonts w:ascii="Arial" w:hAnsi="Arial" w:eastAsia="Microsoft YaHei" w:cs="Arial"/>
+          <w:b/>
+          <w:color w:val="333333"/>
+          <w:sz w:val="18"/>
+          <w:lang w:val="en-US" w:eastAsia="zh-CN"/>
+        </w:rPr>
+        <w:t>植入产品Agent</w:t>
+      </w:r>
+      <w:r>
+        <w:rPr>
+          <w:rFonts w:ascii="Arial" w:hAnsi="Arial" w:eastAsia="Microsoft YaHei" w:cs="Arial"/>
+          <w:b w:val="0"/>
+          <w:color w:val="555555"/>
+          <w:sz w:val="18"/>
+          <w:lang w:val="en-US" w:eastAsia="zh-CN"/>
+        </w:rPr>
+        <w:t>，提升实操场景下的任务完成效能</w:t>
+      </w:r>
+    </w:p>
+    <w:p>
+      <w:pPr>
+        <w:keepNext/>
+        <w:keepLines/>
+        <w:widowControl w:val="0"/>
+        <w:spacing w:before="15" w:after="0" w:lineRule="exact" w:line="230"/>
+        <w:ind w:left="45" w:right="23"/>
+        <w:jc w:val="left"/>
+      </w:pPr>
+      <w:r>
+        <w:rPr>
+          <w:rFonts w:ascii="Arial" w:hAnsi="Arial" w:eastAsia="Microsoft YaHei" w:cs="Arial"/>
+          <w:b/>
+          <w:color w:val="333333"/>
+          <w:sz w:val="18"/>
+          <w:lang w:val="en-US" w:eastAsia="zh-CN"/>
+        </w:rPr>
+        <w:t>二、客户现场AI项目落地</w:t>
+      </w:r>
+    </w:p>
+    <w:p>
+      <w:pPr>
+        <w:keepNext w:val="0"/>
+        <w:keepLines/>
+        <w:widowControl w:val="0"/>
+        <w:spacing w:before="0" w:after="0" w:lineRule="exact" w:line="224"/>
+        <w:ind w:left="45" w:right="23"/>
+        <w:jc w:val="left"/>
+      </w:pPr>
+      <w:r>
+        <w:rPr>
+          <w:rFonts w:ascii="Arial" w:hAnsi="Arial" w:eastAsia="Microsoft YaHei" w:cs="Arial"/>
+          <w:b/>
+          <w:color w:val="333333"/>
+          <w:sz w:val="18"/>
+          <w:lang w:val="en-US" w:eastAsia="zh-CN"/>
+        </w:rPr>
+        <w:t>1.项目背景：</w:t>
+      </w:r>
+      <w:r>
+        <w:rPr>
+          <w:rFonts w:ascii="Arial" w:hAnsi="Arial" w:eastAsia="Microsoft YaHei" w:cs="Arial"/>
+          <w:b w:val="0"/>
+          <w:color w:val="555555"/>
+          <w:sz w:val="18"/>
+          <w:lang w:val="en-US" w:eastAsia="zh-CN"/>
+        </w:rPr>
+        <w:t>客户对产品</w:t>
+      </w:r>
+      <w:r>
+        <w:rPr>
+          <w:rFonts w:ascii="Arial" w:hAnsi="Arial" w:eastAsia="Microsoft YaHei" w:cs="Arial"/>
+          <w:b/>
+          <w:color w:val="333333"/>
+          <w:sz w:val="18"/>
+          <w:lang w:val="en-US" w:eastAsia="zh-CN"/>
+        </w:rPr>
+        <w:t>认知不足</w:t>
+      </w:r>
+      <w:r>
+        <w:rPr>
+          <w:rFonts w:ascii="Arial" w:hAnsi="Arial" w:eastAsia="Microsoft YaHei" w:cs="Arial"/>
+          <w:b w:val="0"/>
+          <w:color w:val="555555"/>
+          <w:sz w:val="18"/>
+          <w:lang w:val="en-US" w:eastAsia="zh-CN"/>
+        </w:rPr>
+        <w:t>，无法自主将AI能力应用于实际业务场景，需现场协助完成</w:t>
+      </w:r>
+      <w:r>
+        <w:rPr>
+          <w:rFonts w:ascii="Arial" w:hAnsi="Arial" w:eastAsia="Microsoft YaHei" w:cs="Arial"/>
+          <w:b/>
+          <w:color w:val="333333"/>
+          <w:sz w:val="18"/>
+          <w:lang w:val="en-US" w:eastAsia="zh-CN"/>
+        </w:rPr>
+        <w:t>产品部署与落地。</w:t>
+      </w:r>
+    </w:p>
+    <w:p>
+      <w:pPr>
+        <w:keepNext w:val="0"/>
+        <w:keepLines/>
+        <w:widowControl w:val="0"/>
+        <w:spacing w:before="0" w:after="0" w:lineRule="exact" w:line="224"/>
+        <w:ind w:left="45" w:right="23"/>
+        <w:jc w:val="left"/>
+      </w:pPr>
+      <w:r>
+        <w:rPr>
+          <w:rFonts w:ascii="Arial" w:hAnsi="Arial" w:eastAsia="Microsoft YaHei" w:cs="Arial"/>
+          <w:b/>
+          <w:color w:val="333333"/>
+          <w:sz w:val="18"/>
+          <w:lang w:val="en-US" w:eastAsia="zh-CN"/>
+        </w:rPr>
+        <w:t>2.项目执行：</w:t>
+      </w:r>
+      <w:r>
+        <w:rPr>
+          <w:rFonts w:ascii="Arial" w:hAnsi="Arial" w:eastAsia="Microsoft YaHei" w:cs="Arial"/>
+          <w:b w:val="0"/>
+          <w:color w:val="555555"/>
+          <w:sz w:val="18"/>
+          <w:lang w:val="en-US" w:eastAsia="zh-CN"/>
+        </w:rPr>
+        <w:t>基于现有AI技术，结合客户实际工作痛点，针对性</w:t>
+      </w:r>
+      <w:r>
+        <w:rPr>
+          <w:rFonts w:ascii="Arial" w:hAnsi="Arial" w:eastAsia="Microsoft YaHei" w:cs="Arial"/>
+          <w:b/>
+          <w:color w:val="333333"/>
+          <w:sz w:val="18"/>
+          <w:lang w:val="en-US" w:eastAsia="zh-CN"/>
+        </w:rPr>
+        <w:t>设计Agent解决方案。</w:t>
+      </w:r>
+    </w:p>
+    <w:p>
+      <w:pPr>
+        <w:keepNext w:val="0"/>
+        <w:keepLines/>
+        <w:widowControl w:val="0"/>
+        <w:spacing w:before="0" w:after="30" w:lineRule="exact" w:line="224"/>
+        <w:ind w:left="45" w:right="23"/>
+        <w:jc w:val="left"/>
+      </w:pPr>
+      <w:r>
+        <w:rPr>
+          <w:rFonts w:ascii="Arial" w:hAnsi="Arial" w:eastAsia="Microsoft YaHei" w:cs="Arial"/>
+          <w:b/>
+          <w:color w:val="333333"/>
+          <w:sz w:val="18"/>
+          <w:lang w:val="en-US" w:eastAsia="zh-CN"/>
+        </w:rPr>
+        <w:t>3.项目结果：</w:t>
+      </w:r>
+      <w:r>
+        <w:rPr>
+          <w:rFonts w:ascii="Arial" w:hAnsi="Arial" w:eastAsia="Microsoft YaHei" w:cs="Arial"/>
+          <w:b w:val="0"/>
+          <w:color w:val="555555"/>
+          <w:sz w:val="18"/>
+          <w:lang w:val="en-US" w:eastAsia="zh-CN"/>
+        </w:rPr>
+        <w:t>以低成本方式</w:t>
+      </w:r>
+      <w:r>
+        <w:rPr>
+          <w:rFonts w:ascii="Arial" w:hAnsi="Arial" w:eastAsia="Microsoft YaHei" w:cs="Arial"/>
+          <w:b/>
+          <w:color w:val="333333"/>
+          <w:sz w:val="18"/>
+          <w:lang w:val="en-US" w:eastAsia="zh-CN"/>
+        </w:rPr>
+        <w:t>替代客户重复性机械工作</w:t>
+      </w:r>
+      <w:r>
+        <w:rPr>
+          <w:rFonts w:ascii="Arial" w:hAnsi="Arial" w:eastAsia="Microsoft YaHei" w:cs="Arial"/>
+          <w:b w:val="0"/>
+          <w:color w:val="555555"/>
+          <w:sz w:val="18"/>
+          <w:lang w:val="en-US" w:eastAsia="zh-CN"/>
+        </w:rPr>
+        <w:t>，打通AI</w:t>
+      </w:r>
+      <w:r>
+        <w:rPr>
+          <w:rFonts w:ascii="Arial" w:hAnsi="Arial" w:eastAsia="Microsoft YaHei" w:cs="Arial"/>
+          <w:b/>
+          <w:color w:val="333333"/>
+          <w:sz w:val="18"/>
+          <w:lang w:val="en-US" w:eastAsia="zh-CN"/>
+        </w:rPr>
+        <w:t>从技术到业务场景</w:t>
+      </w:r>
+      <w:r>
+        <w:rPr>
+          <w:rFonts w:ascii="Arial" w:hAnsi="Arial" w:eastAsia="Microsoft YaHei" w:cs="Arial"/>
+          <w:b w:val="0"/>
+          <w:color w:val="555555"/>
+          <w:sz w:val="18"/>
+          <w:lang w:val="en-US" w:eastAsia="zh-CN"/>
+        </w:rPr>
+        <w:t>的落地闭环</w:t>
+      </w:r>
+    </w:p>
+    <w:tbl>
+      <w:tblPr>
+        <w:tblW w:type="auto" w:w="0"/>
+        <w:jc w:val="center"/>
+        <w:tblLayout w:type="fixed"/>
+        <w:tblLook w:firstColumn="1" w:firstRow="1" w:lastColumn="0" w:lastRow="0" w:noHBand="0" w:noVBand="1" w:val="04A0"/>
+      </w:tblPr>
+      <w:tblGrid>
+        <w:gridCol w:w="2211"/>
+        <w:gridCol w:w="4649"/>
+        <w:gridCol w:w="510"/>
+        <w:gridCol w:w="3175"/>
+      </w:tblGrid>
+      <w:tr>
+        <w:trPr>
+          <w:trHeight w:val="431" w:hRule="atLeast"/>
+          <w:cantSplit/>
+        </w:trPr>
+        <w:tc>
+          <w:tcPr>
+            <w:tcW w:type="dxa" w:w="2211"/>
+            <w:vAlign w:val="center"/>
+            <w:tcMar>
+              <w:top w:w="20" w:type="dxa"/>
+              <w:start w:w="37" w:type="dxa"/>
+              <w:bottom w:w="20" w:type="dxa"/>
+              <w:end w:w="37" w:type="dxa"/>
+            </w:tcMar>
+            <w:tcBorders>
+              <w:top w:val="nil"/>
+              <w:left w:val="nil"/>
+              <w:bottom w:val="nil"/>
+              <w:right w:val="nil"/>
+              <w:insideH w:val="nil"/>
+              <w:insideV w:val="nil"/>
+            </w:tcBorders>
+          </w:tcPr>
+          <w:p>
+            <w:pPr>
+              <w:keepNext w:val="0"/>
+              <w:keepLines/>
+              <w:widowControl w:val="0"/>
+              <w:spacing w:before="0" w:after="0" w:lineRule="exact" w:line="212"/>
+              <w:ind w:left="0" w:right="0"/>
+              <w:jc w:val="left"/>
+            </w:pPr>
+            <w:r>
+              <w:rPr>
+                <w:rFonts w:ascii="Arial" w:hAnsi="Arial" w:eastAsia="Microsoft YaHei" w:cs="Arial"/>
+                <w:b w:val="0"/>
+                <w:color w:val="555555"/>
+                <w:sz w:val="18"/>
+                <w:lang w:val="en-US" w:eastAsia="zh-CN"/>
+              </w:rPr>
+              <w:t>2025-09 ~ 2026-02</w:t>
+            </w:r>
+          </w:p>
+        </w:tc>
+        <w:tc>
+          <w:tcPr>
+            <w:tcW w:type="dxa" w:w="4649"/>
+            <w:vAlign w:val="center"/>
+            <w:tcMar>
+              <w:top w:w="20" w:type="dxa"/>
+              <w:start w:w="37" w:type="dxa"/>
+              <w:bottom w:w="20" w:type="dxa"/>
+              <w:end w:w="37" w:type="dxa"/>
+            </w:tcMar>
+            <w:tcBorders>
+              <w:top w:val="nil"/>
+              <w:left w:val="nil"/>
+              <w:bottom w:val="nil"/>
+              <w:right w:val="nil"/>
+              <w:insideH w:val="nil"/>
+              <w:insideV w:val="nil"/>
+            </w:tcBorders>
+          </w:tcPr>
+          <w:p>
+            <w:pPr>
+              <w:keepNext w:val="0"/>
+              <w:keepLines/>
+              <w:widowControl w:val="0"/>
+              <w:spacing w:before="0" w:after="0" w:lineRule="exact" w:line="219"/>
+              <w:ind w:left="0" w:right="0"/>
+              <w:jc w:val="center"/>
+            </w:pPr>
+            <w:r>
+              <w:rPr>
+                <w:rFonts w:ascii="Arial" w:hAnsi="Arial" w:eastAsia="Microsoft YaHei" w:cs="Arial"/>
+                <w:b/>
+                <w:color w:val="333333"/>
+                <w:sz w:val="18"/>
+                <w:lang w:val="en-US" w:eastAsia="zh-CN"/>
+              </w:rPr>
+              <w:t>上海谈烁信息科技有限公司</w:t>
+            </w:r>
+          </w:p>
+        </w:tc>
+        <w:tc>
+          <w:tcPr>
+            <w:tcW w:type="dxa" w:w="510"/>
+            <w:vAlign w:val="center"/>
+            <w:tcMar>
+              <w:top w:w="20" w:type="dxa"/>
+              <w:start w:w="37" w:type="dxa"/>
+              <w:bottom w:w="20" w:type="dxa"/>
+              <w:end w:w="37" w:type="dxa"/>
+            </w:tcMar>
+            <w:tcBorders>
+              <w:top w:val="nil"/>
+              <w:left w:val="nil"/>
+              <w:bottom w:val="nil"/>
+              <w:right w:val="nil"/>
+              <w:insideH w:val="nil"/>
+              <w:insideV w:val="nil"/>
+            </w:tcBorders>
+          </w:tcPr>
+          <w:p>
+            <w:pPr>
+              <w:keepLines/>
+              <w:widowControl w:val="0"/>
+              <w:spacing w:before="0" w:after="0" w:lineRule="atLeast" w:line="420"/>
+              <w:jc w:val="center"/>
+            </w:pPr>
+            <w:r>
+              <w:drawing>
+                <wp:inline xmlns:a="http://schemas.openxmlformats.org/drawingml/2006/main" xmlns:pic="http://schemas.openxmlformats.org/drawingml/2006/picture">
+                  <wp:extent cx="252000" cy="252000"/>
+                  <wp:docPr id="3" name="Picture 3"/>
+                  <wp:cNvGraphicFramePr>
+                    <a:graphicFrameLocks noChangeAspect="1"/>
+                  </wp:cNvGraphicFramePr>
+                  <a:graphic>
+                    <a:graphicData uri="http://schemas.openxmlformats.org/drawingml/2006/picture">
+                      <pic:pic>
+                        <pic:nvPicPr>
+                          <pic:cNvPr id="0" name="logo_tanshuo_technology.png"/>
+                          <pic:cNvPicPr/>
+                        </pic:nvPicPr>
+                        <pic:blipFill>
+                          <a:blip r:embed="rId12"/>
+                          <a:stretch>
+                            <a:fillRect/>
+                          </a:stretch>
+                        </pic:blipFill>
+                        <pic:spPr>
+                          <a:xfrm>
+                            <a:off x="0" y="0"/>
+                            <a:ext cx="252000" cy="252000"/>
+                          </a:xfrm>
+                          <a:prstGeom prst="rect"/>
+                        </pic:spPr>
+                      </pic:pic>
+                    </a:graphicData>
+                  </a:graphic>
+                </wp:inline>
+              </w:drawing>
+            </w:r>
+          </w:p>
+        </w:tc>
+        <w:tc>
+          <w:tcPr>
+            <w:tcW w:type="dxa" w:w="3175"/>
+            <w:vAlign w:val="center"/>
+            <w:tcMar>
+              <w:top w:w="20" w:type="dxa"/>
+              <w:start w:w="37" w:type="dxa"/>
+              <w:bottom w:w="20" w:type="dxa"/>
+              <w:end w:w="37" w:type="dxa"/>
+            </w:tcMar>
+            <w:tcBorders>
+              <w:top w:val="nil"/>
+              <w:left w:val="nil"/>
+              <w:bottom w:val="nil"/>
+              <w:right w:val="nil"/>
+              <w:insideH w:val="nil"/>
+              <w:insideV w:val="nil"/>
+            </w:tcBorders>
+          </w:tcPr>
+          <w:p>
+            <w:pPr>
+              <w:keepNext w:val="0"/>
+              <w:keepLines/>
+              <w:widowControl w:val="0"/>
+              <w:spacing w:before="0" w:after="0" w:lineRule="exact" w:line="212"/>
+              <w:ind w:left="0" w:right="0"/>
+              <w:jc w:val="right"/>
+            </w:pPr>
+            <w:r>
+              <w:rPr>
+                <w:rFonts w:ascii="Arial" w:hAnsi="Arial" w:eastAsia="Microsoft YaHei" w:cs="Arial"/>
+                <w:b/>
+                <w:color w:val="333333"/>
+                <w:sz w:val="18"/>
+                <w:lang w:val="en-US" w:eastAsia="zh-CN"/>
+              </w:rPr>
+              <w:t>AI产品经理实习生</w:t>
+            </w:r>
+          </w:p>
+        </w:tc>
+      </w:tr>
+    </w:tbl>
+    <w:p>
+      <w:pPr>
+        <w:keepNext/>
+        <w:keepLines/>
+        <w:widowControl w:val="0"/>
+        <w:spacing w:before="15" w:after="0" w:lineRule="exact" w:line="230"/>
+        <w:ind w:left="45" w:right="23"/>
+        <w:jc w:val="left"/>
+      </w:pPr>
+      <w:r>
+        <w:rPr>
+          <w:rFonts w:ascii="Arial" w:hAnsi="Arial" w:eastAsia="Microsoft YaHei" w:cs="Arial"/>
+          <w:b/>
+          <w:color w:val="333333"/>
+          <w:sz w:val="18"/>
+          <w:lang w:val="en-US" w:eastAsia="zh-CN"/>
+        </w:rPr>
+        <w:t>一、“Soultalk App”功能迭代和优化</w:t>
+      </w:r>
+    </w:p>
+    <w:p>
+      <w:pPr>
+        <w:keepNext w:val="0"/>
+        <w:keepLines/>
+        <w:widowControl w:val="0"/>
+        <w:spacing w:before="0" w:after="0" w:lineRule="exact" w:line="224"/>
+        <w:ind w:left="45" w:right="23"/>
+        <w:jc w:val="left"/>
+      </w:pPr>
+      <w:r>
+        <w:rPr>
+          <w:rFonts w:ascii="Arial" w:hAnsi="Arial" w:eastAsia="Microsoft YaHei" w:cs="Arial"/>
+          <w:b/>
+          <w:color w:val="333333"/>
+          <w:sz w:val="18"/>
+          <w:lang w:val="en-US" w:eastAsia="zh-CN"/>
+        </w:rPr>
+        <w:t>1.AI生图/生视频:</w:t>
+      </w:r>
+      <w:r>
+        <w:rPr>
+          <w:rFonts w:ascii="Arial" w:hAnsi="Arial" w:eastAsia="Microsoft YaHei" w:cs="Arial"/>
+          <w:b w:val="0"/>
+          <w:color w:val="555555"/>
+          <w:sz w:val="18"/>
+          <w:lang w:val="en-US" w:eastAsia="zh-CN"/>
+        </w:rPr>
+        <w:t>为了增加APP盈利和提升用户体验，设计</w:t>
+      </w:r>
+      <w:r>
+        <w:rPr>
+          <w:rFonts w:ascii="Arial" w:hAnsi="Arial" w:eastAsia="Microsoft YaHei" w:cs="Arial"/>
+          <w:b/>
+          <w:color w:val="333333"/>
+          <w:sz w:val="18"/>
+          <w:lang w:val="en-US" w:eastAsia="zh-CN"/>
+        </w:rPr>
+        <w:t>AI生图和生视频</w:t>
+      </w:r>
+      <w:r>
+        <w:rPr>
+          <w:rFonts w:ascii="Arial" w:hAnsi="Arial" w:eastAsia="Microsoft YaHei" w:cs="Arial"/>
+          <w:b w:val="0"/>
+          <w:color w:val="555555"/>
+          <w:sz w:val="18"/>
+          <w:lang w:val="en-US" w:eastAsia="zh-CN"/>
+        </w:rPr>
+        <w:t>功能，用户可根据自己喜好进行对应操作。</w:t>
+      </w:r>
+    </w:p>
+    <w:p>
+      <w:pPr>
+        <w:keepNext w:val="0"/>
+        <w:keepLines/>
+        <w:widowControl w:val="0"/>
+        <w:spacing w:before="0" w:after="0" w:lineRule="exact" w:line="224"/>
+        <w:ind w:left="45" w:right="23"/>
+        <w:jc w:val="left"/>
+      </w:pPr>
+      <w:r>
+        <w:rPr>
+          <w:rFonts w:ascii="Arial" w:hAnsi="Arial" w:eastAsia="Microsoft YaHei" w:cs="Arial"/>
+          <w:b/>
+          <w:color w:val="333333"/>
+          <w:sz w:val="18"/>
+          <w:lang w:val="en-US" w:eastAsia="zh-CN"/>
+        </w:rPr>
+        <w:t>2.消息推送优化:</w:t>
+      </w:r>
+      <w:r>
+        <w:rPr>
+          <w:rFonts w:ascii="Arial" w:hAnsi="Arial" w:eastAsia="Microsoft YaHei" w:cs="Arial"/>
+          <w:b w:val="0"/>
+          <w:color w:val="555555"/>
+          <w:sz w:val="18"/>
+          <w:lang w:val="en-US" w:eastAsia="zh-CN"/>
+        </w:rPr>
+        <w:t>为了提升APP召回率，设计app用户推送消息的机制，提升APP粘性。点击率</w:t>
+      </w:r>
+      <w:r>
+        <w:rPr>
+          <w:rFonts w:ascii="Arial" w:hAnsi="Arial" w:eastAsia="Microsoft YaHei" w:cs="Arial"/>
+          <w:b/>
+          <w:color w:val="333333"/>
+          <w:sz w:val="18"/>
+          <w:lang w:val="en-US" w:eastAsia="zh-CN"/>
+        </w:rPr>
+        <w:t>由2.3%提高至7.8%</w:t>
+      </w:r>
+    </w:p>
+    <w:p>
+      <w:pPr>
+        <w:keepNext/>
+        <w:keepLines/>
+        <w:widowControl w:val="0"/>
+        <w:spacing w:before="15" w:after="0" w:lineRule="exact" w:line="230"/>
+        <w:ind w:left="45" w:right="23"/>
+        <w:jc w:val="left"/>
+      </w:pPr>
+      <w:r>
+        <w:rPr>
+          <w:rFonts w:ascii="Arial" w:hAnsi="Arial" w:eastAsia="Microsoft YaHei" w:cs="Arial"/>
+          <w:b/>
+          <w:color w:val="333333"/>
+          <w:sz w:val="18"/>
+          <w:lang w:val="en-US" w:eastAsia="zh-CN"/>
+        </w:rPr>
+        <w:t>二、用户自创角色机制设计</w:t>
+      </w:r>
+    </w:p>
+    <w:p>
+      <w:pPr>
+        <w:keepNext w:val="0"/>
+        <w:keepLines/>
+        <w:widowControl w:val="0"/>
+        <w:spacing w:before="0" w:after="0" w:lineRule="exact" w:line="224"/>
+        <w:ind w:left="45" w:right="23"/>
+        <w:jc w:val="left"/>
+      </w:pPr>
+      <w:r>
+        <w:rPr>
+          <w:rFonts w:ascii="Arial" w:hAnsi="Arial" w:eastAsia="Microsoft YaHei" w:cs="Arial"/>
+          <w:b/>
+          <w:color w:val="333333"/>
+          <w:sz w:val="18"/>
+          <w:lang w:val="en-US" w:eastAsia="zh-CN"/>
+        </w:rPr>
+        <w:t>1.需求洞察:</w:t>
+      </w:r>
+      <w:r>
+        <w:rPr>
+          <w:rFonts w:ascii="Arial" w:hAnsi="Arial" w:eastAsia="Microsoft YaHei" w:cs="Arial"/>
+          <w:b w:val="0"/>
+          <w:color w:val="555555"/>
+          <w:sz w:val="18"/>
+          <w:lang w:val="en-US" w:eastAsia="zh-CN"/>
+        </w:rPr>
+        <w:t>针对用户创作耐心低、新手不擅长撰写角色的痛点，设计可激起用户</w:t>
+      </w:r>
+      <w:r>
+        <w:rPr>
+          <w:rFonts w:ascii="Arial" w:hAnsi="Arial" w:eastAsia="Microsoft YaHei" w:cs="Arial"/>
+          <w:b/>
+          <w:color w:val="333333"/>
+          <w:sz w:val="18"/>
+          <w:lang w:val="en-US" w:eastAsia="zh-CN"/>
+        </w:rPr>
+        <w:t>自创角色</w:t>
+      </w:r>
+      <w:r>
+        <w:rPr>
+          <w:rFonts w:ascii="Arial" w:hAnsi="Arial" w:eastAsia="Microsoft YaHei" w:cs="Arial"/>
+          <w:b w:val="0"/>
+          <w:color w:val="555555"/>
+          <w:sz w:val="18"/>
+          <w:lang w:val="en-US" w:eastAsia="zh-CN"/>
+        </w:rPr>
+        <w:t>热情的机制。</w:t>
+      </w:r>
+    </w:p>
+    <w:p>
+      <w:pPr>
+        <w:keepNext w:val="0"/>
+        <w:keepLines/>
+        <w:widowControl w:val="0"/>
+        <w:spacing w:before="0" w:after="30" w:lineRule="exact" w:line="224"/>
+        <w:ind w:left="45" w:right="23"/>
+        <w:jc w:val="left"/>
+      </w:pPr>
+      <w:r>
+        <w:rPr>
+          <w:rFonts w:ascii="Arial" w:hAnsi="Arial" w:eastAsia="Microsoft YaHei" w:cs="Arial"/>
+          <w:b/>
+          <w:color w:val="333333"/>
+          <w:sz w:val="18"/>
+          <w:lang w:val="en-US" w:eastAsia="zh-CN"/>
+        </w:rPr>
+        <w:t>2.关键产品设计:</w:t>
+      </w:r>
+      <w:r>
+        <w:rPr>
+          <w:rFonts w:ascii="Arial" w:hAnsi="Arial" w:eastAsia="Microsoft YaHei" w:cs="Arial"/>
+          <w:b w:val="0"/>
+          <w:color w:val="555555"/>
+          <w:sz w:val="18"/>
+          <w:lang w:val="en-US" w:eastAsia="zh-CN"/>
+        </w:rPr>
+        <w:t>通过任务激励机制、AI创作辅助、创作反馈系统，来降低用户自创角色难度，角色多样性</w:t>
+      </w:r>
+      <w:r>
+        <w:rPr>
+          <w:rFonts w:ascii="Arial" w:hAnsi="Arial" w:eastAsia="Microsoft YaHei" w:cs="Arial"/>
+          <w:b/>
+          <w:color w:val="333333"/>
+          <w:sz w:val="18"/>
+          <w:lang w:val="en-US" w:eastAsia="zh-CN"/>
+        </w:rPr>
+        <w:t>提高30%</w:t>
+      </w:r>
+    </w:p>
+    <w:tbl>
+      <w:tblPr>
+        <w:tblW w:type="auto" w:w="0"/>
+        <w:jc w:val="center"/>
+        <w:tblLayout w:type="fixed"/>
+        <w:tblLook w:firstColumn="1" w:firstRow="1" w:lastColumn="0" w:lastRow="0" w:noHBand="0" w:noVBand="1" w:val="04A0"/>
+      </w:tblPr>
+      <w:tblGrid>
+        <w:gridCol w:w="2211"/>
+        <w:gridCol w:w="4649"/>
+        <w:gridCol w:w="510"/>
+        <w:gridCol w:w="3175"/>
+      </w:tblGrid>
+      <w:tr>
+        <w:trPr>
+          <w:trHeight w:val="431" w:hRule="atLeast"/>
+          <w:cantSplit/>
+        </w:trPr>
+        <w:tc>
+          <w:tcPr>
+            <w:tcW w:type="dxa" w:w="2211"/>
+            <w:vAlign w:val="center"/>
+            <w:tcMar>
+              <w:top w:w="20" w:type="dxa"/>
+              <w:start w:w="37" w:type="dxa"/>
+              <w:bottom w:w="20" w:type="dxa"/>
+              <w:end w:w="37" w:type="dxa"/>
+            </w:tcMar>
+            <w:tcBorders>
+              <w:top w:val="nil"/>
+              <w:left w:val="nil"/>
+              <w:bottom w:val="nil"/>
+              <w:right w:val="nil"/>
+              <w:insideH w:val="nil"/>
+              <w:insideV w:val="nil"/>
+            </w:tcBorders>
+          </w:tcPr>
+          <w:p>
+            <w:pPr>
+              <w:keepNext w:val="0"/>
+              <w:keepLines/>
+              <w:widowControl w:val="0"/>
+              <w:spacing w:before="0" w:after="0" w:lineRule="exact" w:line="212"/>
+              <w:ind w:left="0" w:right="0"/>
+              <w:jc w:val="left"/>
+            </w:pPr>
+            <w:r>
+              <w:rPr>
+                <w:rFonts w:ascii="Arial" w:hAnsi="Arial" w:eastAsia="Microsoft YaHei" w:cs="Arial"/>
+                <w:b w:val="0"/>
+                <w:color w:val="555555"/>
+                <w:sz w:val="18"/>
+                <w:lang w:val="en-US" w:eastAsia="zh-CN"/>
+              </w:rPr>
+              <w:t>2025-03 ~ 2025-08</w:t>
+            </w:r>
+          </w:p>
+        </w:tc>
+        <w:tc>
+          <w:tcPr>
+            <w:tcW w:type="dxa" w:w="4649"/>
+            <w:vAlign w:val="center"/>
+            <w:tcMar>
+              <w:top w:w="20" w:type="dxa"/>
+              <w:start w:w="37" w:type="dxa"/>
+              <w:bottom w:w="20" w:type="dxa"/>
+              <w:end w:w="37" w:type="dxa"/>
+            </w:tcMar>
+            <w:tcBorders>
+              <w:top w:val="nil"/>
+              <w:left w:val="nil"/>
+              <w:bottom w:val="nil"/>
+              <w:right w:val="nil"/>
+              <w:insideH w:val="nil"/>
+              <w:insideV w:val="nil"/>
+            </w:tcBorders>
+          </w:tcPr>
+          <w:p>
+            <w:pPr>
+              <w:keepNext w:val="0"/>
+              <w:keepLines/>
+              <w:widowControl w:val="0"/>
+              <w:spacing w:before="0" w:after="0" w:lineRule="exact" w:line="219"/>
+              <w:ind w:left="0" w:right="0"/>
+              <w:jc w:val="center"/>
+            </w:pPr>
+            <w:r>
+              <w:rPr>
+                <w:rFonts w:ascii="Arial" w:hAnsi="Arial" w:eastAsia="Microsoft YaHei" w:cs="Arial"/>
+                <w:b/>
+                <w:color w:val="333333"/>
+                <w:sz w:val="18"/>
+                <w:lang w:val="en-US" w:eastAsia="zh-CN"/>
+              </w:rPr>
+              <w:t>引力传媒（上海）有限公司</w:t>
+            </w:r>
+          </w:p>
+        </w:tc>
+        <w:tc>
+          <w:tcPr>
+            <w:tcW w:type="dxa" w:w="510"/>
+            <w:vAlign w:val="center"/>
+            <w:tcMar>
+              <w:top w:w="20" w:type="dxa"/>
+              <w:start w:w="37" w:type="dxa"/>
+              <w:bottom w:w="20" w:type="dxa"/>
+              <w:end w:w="37" w:type="dxa"/>
+            </w:tcMar>
+            <w:tcBorders>
+              <w:top w:val="nil"/>
+              <w:left w:val="nil"/>
+              <w:bottom w:val="nil"/>
+              <w:right w:val="nil"/>
+              <w:insideH w:val="nil"/>
+              <w:insideV w:val="nil"/>
+            </w:tcBorders>
+          </w:tcPr>
+          <w:p>
+            <w:pPr>
+              <w:keepLines/>
+              <w:widowControl w:val="0"/>
+              <w:spacing w:before="0" w:after="0" w:lineRule="atLeast" w:line="420"/>
+              <w:jc w:val="center"/>
+            </w:pPr>
+            <w:r>
+              <w:drawing>
+                <wp:inline xmlns:a="http://schemas.openxmlformats.org/drawingml/2006/main" xmlns:pic="http://schemas.openxmlformats.org/drawingml/2006/picture">
+                  <wp:extent cx="252000" cy="252000"/>
+                  <wp:docPr id="4" name="Picture 4"/>
+                  <wp:cNvGraphicFramePr>
+                    <a:graphicFrameLocks noChangeAspect="1"/>
+                  </wp:cNvGraphicFramePr>
+                  <a:graphic>
+                    <a:graphicData uri="http://schemas.openxmlformats.org/drawingml/2006/picture">
+                      <pic:pic>
+                        <pic:nvPicPr>
+                          <pic:cNvPr id="0" name="logo_inly.png"/>
+                          <pic:cNvPicPr/>
+                        </pic:nvPicPr>
+                        <pic:blipFill>
+                          <a:blip r:embed="rId13"/>
+                          <a:stretch>
+                            <a:fillRect/>
+                          </a:stretch>
+                        </pic:blipFill>
+                        <pic:spPr>
+                          <a:xfrm>
+                            <a:off x="0" y="0"/>
+                            <a:ext cx="252000" cy="252000"/>
+                          </a:xfrm>
+                          <a:prstGeom prst="rect"/>
+                        </pic:spPr>
+                      </pic:pic>
+                    </a:graphicData>
+                  </a:graphic>
+                </wp:inline>
+              </w:drawing>
+            </w:r>
+          </w:p>
+        </w:tc>
+        <w:tc>
+          <w:tcPr>
+            <w:tcW w:type="dxa" w:w="3175"/>
+            <w:vAlign w:val="center"/>
+            <w:tcMar>
+              <w:top w:w="20" w:type="dxa"/>
+              <w:start w:w="37" w:type="dxa"/>
+              <w:bottom w:w="20" w:type="dxa"/>
+              <w:end w:w="37" w:type="dxa"/>
+            </w:tcMar>
+            <w:tcBorders>
+              <w:top w:val="nil"/>
+              <w:left w:val="nil"/>
+              <w:bottom w:val="nil"/>
+              <w:right w:val="nil"/>
+              <w:insideH w:val="nil"/>
+              <w:insideV w:val="nil"/>
+            </w:tcBorders>
+          </w:tcPr>
+          <w:p>
+            <w:pPr>
+              <w:keepNext w:val="0"/>
+              <w:keepLines/>
+              <w:widowControl w:val="0"/>
+              <w:spacing w:before="0" w:after="0" w:lineRule="exact" w:line="212"/>
+              <w:ind w:left="0" w:right="0"/>
+              <w:jc w:val="right"/>
+            </w:pPr>
+            <w:r>
+              <w:rPr>
+                <w:rFonts w:ascii="Arial" w:hAnsi="Arial" w:eastAsia="Microsoft YaHei" w:cs="Arial"/>
+                <w:b/>
+                <w:color w:val="333333"/>
+                <w:sz w:val="18"/>
+                <w:lang w:val="en-US" w:eastAsia="zh-CN"/>
+              </w:rPr>
+              <w:t>AI产品经理实习生</w:t>
+            </w:r>
+          </w:p>
+        </w:tc>
+      </w:tr>
+    </w:tbl>
+    <w:p>
+      <w:pPr>
+        <w:keepNext/>
+        <w:keepLines/>
+        <w:widowControl w:val="0"/>
+        <w:spacing w:before="15" w:after="0" w:lineRule="exact" w:line="230"/>
+        <w:ind w:left="45" w:right="23"/>
+        <w:jc w:val="left"/>
+      </w:pPr>
+      <w:r>
+        <w:rPr>
+          <w:rFonts w:ascii="Arial" w:hAnsi="Arial" w:eastAsia="Microsoft YaHei" w:cs="Arial"/>
+          <w:b/>
+          <w:color w:val="333333"/>
+          <w:sz w:val="18"/>
+          <w:lang w:val="en-US" w:eastAsia="zh-CN"/>
+        </w:rPr>
+        <w:t>一、项目背景:</w:t>
+      </w:r>
+      <w:r>
+        <w:rPr>
+          <w:rFonts w:ascii="Arial" w:hAnsi="Arial" w:eastAsia="Microsoft YaHei" w:cs="Arial"/>
+          <w:b w:val="0"/>
+          <w:color w:val="555555"/>
+          <w:sz w:val="18"/>
+          <w:lang w:val="en-US" w:eastAsia="zh-CN"/>
+        </w:rPr>
+        <w:t>为提升客服效率，项目基于RAG架构搭建</w:t>
+      </w:r>
+      <w:r>
+        <w:rPr>
+          <w:rFonts w:ascii="Arial" w:hAnsi="Arial" w:eastAsia="Microsoft YaHei" w:cs="Arial"/>
+          <w:b/>
+          <w:color w:val="333333"/>
+          <w:sz w:val="18"/>
+          <w:lang w:val="en-US" w:eastAsia="zh-CN"/>
+        </w:rPr>
+        <w:t>AI智能客服系统</w:t>
+      </w:r>
+      <w:r>
+        <w:rPr>
+          <w:rFonts w:ascii="Arial" w:hAnsi="Arial" w:eastAsia="Microsoft YaHei" w:cs="Arial"/>
+          <w:b w:val="0"/>
+          <w:color w:val="555555"/>
+          <w:sz w:val="18"/>
+          <w:lang w:val="en-US" w:eastAsia="zh-CN"/>
+        </w:rPr>
+        <w:t>，具备“多轮对话理解,智能转人工”等核心能力。</w:t>
+      </w:r>
+    </w:p>
+    <w:p>
+      <w:pPr>
+        <w:keepNext/>
+        <w:keepLines/>
+        <w:widowControl w:val="0"/>
+        <w:spacing w:before="15" w:after="0" w:lineRule="exact" w:line="230"/>
+        <w:ind w:left="45" w:right="23"/>
+        <w:jc w:val="left"/>
+      </w:pPr>
+      <w:r>
+        <w:rPr>
+          <w:rFonts w:ascii="Arial" w:hAnsi="Arial" w:eastAsia="Microsoft YaHei" w:cs="Arial"/>
+          <w:b/>
+          <w:color w:val="333333"/>
+          <w:sz w:val="18"/>
+          <w:lang w:val="en-US" w:eastAsia="zh-CN"/>
+        </w:rPr>
+        <w:t>二、项目执行:</w:t>
+      </w:r>
+    </w:p>
+    <w:p>
+      <w:pPr>
+        <w:keepNext w:val="0"/>
+        <w:keepLines/>
+        <w:widowControl w:val="0"/>
+        <w:spacing w:before="0" w:after="0" w:lineRule="exact" w:line="224"/>
+        <w:ind w:left="45" w:right="23"/>
+        <w:jc w:val="left"/>
+      </w:pPr>
+      <w:r>
+        <w:rPr>
+          <w:rFonts w:ascii="Arial" w:hAnsi="Arial" w:eastAsia="Microsoft YaHei" w:cs="Arial"/>
+          <w:b/>
+          <w:color w:val="333333"/>
+          <w:sz w:val="18"/>
+          <w:lang w:val="en-US" w:eastAsia="zh-CN"/>
+        </w:rPr>
+        <w:t>1.需求分析与内容抽取:</w:t>
+      </w:r>
+      <w:r>
+        <w:rPr>
+          <w:rFonts w:ascii="Arial" w:hAnsi="Arial" w:eastAsia="Microsoft YaHei" w:cs="Arial"/>
+          <w:b w:val="0"/>
+          <w:color w:val="555555"/>
+          <w:sz w:val="18"/>
+          <w:lang w:val="en-US" w:eastAsia="zh-CN"/>
+        </w:rPr>
+        <w:t>梳理品牌在社媒平台的客服对话记录，提炼出4类</w:t>
+      </w:r>
+      <w:r>
+        <w:rPr>
+          <w:rFonts w:ascii="Arial" w:hAnsi="Arial" w:eastAsia="Microsoft YaHei" w:cs="Arial"/>
+          <w:b/>
+          <w:color w:val="333333"/>
+          <w:sz w:val="18"/>
+          <w:lang w:val="en-US" w:eastAsia="zh-CN"/>
+        </w:rPr>
+        <w:t>高频场景</w:t>
+      </w:r>
+      <w:r>
+        <w:rPr>
+          <w:rFonts w:ascii="Arial" w:hAnsi="Arial" w:eastAsia="Microsoft YaHei" w:cs="Arial"/>
+          <w:b w:val="0"/>
+          <w:color w:val="555555"/>
+          <w:sz w:val="18"/>
+          <w:lang w:val="en-US" w:eastAsia="zh-CN"/>
+        </w:rPr>
+        <w:t>形成训练语料。</w:t>
+      </w:r>
+    </w:p>
+    <w:p>
+      <w:pPr>
+        <w:keepNext w:val="0"/>
+        <w:keepLines/>
+        <w:widowControl w:val="0"/>
+        <w:spacing w:before="0" w:after="0" w:lineRule="exact" w:line="224"/>
+        <w:ind w:left="45" w:right="23"/>
+        <w:jc w:val="left"/>
+      </w:pPr>
+      <w:r>
+        <w:rPr>
+          <w:rFonts w:ascii="Arial" w:hAnsi="Arial" w:eastAsia="Microsoft YaHei" w:cs="Arial"/>
+          <w:b/>
+          <w:color w:val="333333"/>
+          <w:sz w:val="18"/>
+          <w:lang w:val="en-US" w:eastAsia="zh-CN"/>
+        </w:rPr>
+        <w:t>2.知识库构建与系统设计:</w:t>
+      </w:r>
+      <w:r>
+        <w:rPr>
+          <w:rFonts w:ascii="Arial" w:hAnsi="Arial" w:eastAsia="Microsoft YaHei" w:cs="Arial"/>
+          <w:b w:val="0"/>
+          <w:color w:val="555555"/>
+          <w:sz w:val="18"/>
+          <w:lang w:val="en-US" w:eastAsia="zh-CN"/>
+        </w:rPr>
+        <w:t>采用RAG框架对接售后政策与商品信息，实现“FAQ智能召回+商品知识匹配”的</w:t>
+      </w:r>
+      <w:r>
+        <w:rPr>
+          <w:rFonts w:ascii="Arial" w:hAnsi="Arial" w:eastAsia="Microsoft YaHei" w:cs="Arial"/>
+          <w:b/>
+          <w:color w:val="333333"/>
+          <w:sz w:val="18"/>
+          <w:lang w:val="en-US" w:eastAsia="zh-CN"/>
+        </w:rPr>
+        <w:t>问答引擎</w:t>
+      </w:r>
+      <w:r>
+        <w:rPr>
+          <w:rFonts w:ascii="Arial" w:hAnsi="Arial" w:eastAsia="Microsoft YaHei" w:cs="Arial"/>
+          <w:b w:val="0"/>
+          <w:color w:val="555555"/>
+          <w:sz w:val="18"/>
+          <w:lang w:val="en-US" w:eastAsia="zh-CN"/>
+        </w:rPr>
+        <w:t>。</w:t>
+      </w:r>
+    </w:p>
+    <w:p>
+      <w:pPr>
+        <w:keepNext w:val="0"/>
+        <w:keepLines/>
+        <w:widowControl w:val="0"/>
+        <w:spacing w:before="0" w:after="0" w:lineRule="exact" w:line="224"/>
+        <w:ind w:left="45" w:right="23"/>
+        <w:jc w:val="left"/>
+      </w:pPr>
+      <w:r>
+        <w:rPr>
+          <w:rFonts w:ascii="Arial" w:hAnsi="Arial" w:eastAsia="Microsoft YaHei" w:cs="Arial"/>
+          <w:b/>
+          <w:color w:val="333333"/>
+          <w:sz w:val="18"/>
+          <w:lang w:val="en-US" w:eastAsia="zh-CN"/>
+        </w:rPr>
+        <w:t>3.转人工机制:</w:t>
+      </w:r>
+      <w:r>
+        <w:rPr>
+          <w:rFonts w:ascii="Arial" w:hAnsi="Arial" w:eastAsia="Microsoft YaHei" w:cs="Arial"/>
+          <w:b w:val="0"/>
+          <w:color w:val="555555"/>
+          <w:sz w:val="18"/>
+          <w:lang w:val="en-US" w:eastAsia="zh-CN"/>
+        </w:rPr>
+        <w:t>构建“会话记录+实时响应+转人工引导”</w:t>
+      </w:r>
+      <w:r>
+        <w:rPr>
+          <w:rFonts w:ascii="Arial" w:hAnsi="Arial" w:eastAsia="Microsoft YaHei" w:cs="Arial"/>
+          <w:b/>
+          <w:color w:val="333333"/>
+          <w:sz w:val="18"/>
+          <w:lang w:val="en-US" w:eastAsia="zh-CN"/>
+        </w:rPr>
+        <w:t>三栏式界面</w:t>
+      </w:r>
+      <w:r>
+        <w:rPr>
+          <w:rFonts w:ascii="Arial" w:hAnsi="Arial" w:eastAsia="Microsoft YaHei" w:cs="Arial"/>
+          <w:b w:val="0"/>
+          <w:color w:val="555555"/>
+          <w:sz w:val="18"/>
+          <w:lang w:val="en-US" w:eastAsia="zh-CN"/>
+        </w:rPr>
+        <w:t>，设置用户满意度反馈、标注打分与人工接入机制</w:t>
+      </w:r>
+    </w:p>
+    <w:p>
+      <w:pPr>
+        <w:keepNext/>
+        <w:keepLines/>
+        <w:widowControl w:val="0"/>
+        <w:spacing w:before="15" w:after="30" w:lineRule="exact" w:line="230"/>
+        <w:ind w:left="45" w:right="23"/>
+        <w:jc w:val="left"/>
+      </w:pPr>
+      <w:r>
+        <w:rPr>
+          <w:rFonts w:ascii="Arial" w:hAnsi="Arial" w:eastAsia="Microsoft YaHei" w:cs="Arial"/>
+          <w:b/>
+          <w:color w:val="333333"/>
+          <w:sz w:val="18"/>
+          <w:lang w:val="en-US" w:eastAsia="zh-CN"/>
+        </w:rPr>
+        <w:t>三、项目结果:</w:t>
+      </w:r>
+      <w:r>
+        <w:rPr>
+          <w:rFonts w:ascii="Arial" w:hAnsi="Arial" w:eastAsia="Microsoft YaHei" w:cs="Arial"/>
+          <w:b w:val="0"/>
+          <w:color w:val="555555"/>
+          <w:sz w:val="18"/>
+          <w:lang w:val="en-US" w:eastAsia="zh-CN"/>
+        </w:rPr>
+        <w:t>客服响应准确率</w:t>
+      </w:r>
+      <w:r>
+        <w:rPr>
+          <w:rFonts w:ascii="Arial" w:hAnsi="Arial" w:eastAsia="Microsoft YaHei" w:cs="Arial"/>
+          <w:b/>
+          <w:color w:val="333333"/>
+          <w:sz w:val="18"/>
+          <w:lang w:val="en-US" w:eastAsia="zh-CN"/>
+        </w:rPr>
+        <w:t>提升至91%</w:t>
+      </w:r>
+      <w:r>
+        <w:rPr>
+          <w:rFonts w:ascii="Arial" w:hAnsi="Arial" w:eastAsia="Microsoft YaHei" w:cs="Arial"/>
+          <w:b w:val="0"/>
+          <w:color w:val="555555"/>
+          <w:sz w:val="18"/>
+          <w:lang w:val="en-US" w:eastAsia="zh-CN"/>
+        </w:rPr>
+        <w:t>，转人工率</w:t>
+      </w:r>
+      <w:r>
+        <w:rPr>
+          <w:rFonts w:ascii="Arial" w:hAnsi="Arial" w:eastAsia="Microsoft YaHei" w:cs="Arial"/>
+          <w:b/>
+          <w:color w:val="333333"/>
+          <w:sz w:val="18"/>
+          <w:lang w:val="en-US" w:eastAsia="zh-CN"/>
+        </w:rPr>
+        <w:t>下降25%</w:t>
+      </w:r>
+      <w:r>
+        <w:rPr>
+          <w:rFonts w:ascii="Arial" w:hAnsi="Arial" w:eastAsia="Microsoft YaHei" w:cs="Arial"/>
+          <w:b w:val="0"/>
+          <w:color w:val="555555"/>
+          <w:sz w:val="18"/>
+          <w:lang w:val="en-US" w:eastAsia="zh-CN"/>
+        </w:rPr>
+        <w:t>;覆盖用户问题类型</w:t>
+      </w:r>
+      <w:r>
+        <w:rPr>
+          <w:rFonts w:ascii="Arial" w:hAnsi="Arial" w:eastAsia="Microsoft YaHei" w:cs="Arial"/>
+          <w:b/>
+          <w:color w:val="333333"/>
+          <w:sz w:val="18"/>
+          <w:lang w:val="en-US" w:eastAsia="zh-CN"/>
+        </w:rPr>
+        <w:t>超90%</w:t>
+      </w:r>
+      <w:r>
+        <w:rPr>
+          <w:rFonts w:ascii="Arial" w:hAnsi="Arial" w:eastAsia="Microsoft YaHei" w:cs="Arial"/>
+          <w:b w:val="0"/>
+          <w:color w:val="555555"/>
+          <w:sz w:val="18"/>
+          <w:lang w:val="en-US" w:eastAsia="zh-CN"/>
+        </w:rPr>
+        <w:t>，售后咨询自动化替代率</w:t>
+      </w:r>
+      <w:r>
+        <w:rPr>
+          <w:rFonts w:ascii="Arial" w:hAnsi="Arial" w:eastAsia="Microsoft YaHei" w:cs="Arial"/>
+          <w:b/>
+          <w:color w:val="333333"/>
+          <w:sz w:val="18"/>
+          <w:lang w:val="en-US" w:eastAsia="zh-CN"/>
+        </w:rPr>
+        <w:t>达25%</w:t>
+      </w:r>
+    </w:p>
+    <w:tbl>
+      <w:tblPr>
+        <w:tblW w:type="auto" w:w="0"/>
+        <w:jc w:val="center"/>
+        <w:tblLayout w:type="fixed"/>
+        <w:tblLook w:firstColumn="1" w:firstRow="1" w:lastColumn="0" w:lastRow="0" w:noHBand="0" w:noVBand="1" w:val="04A0"/>
+      </w:tblPr>
+      <w:tblGrid>
+        <w:gridCol w:w="2438"/>
+        <w:gridCol w:w="8107"/>
+      </w:tblGrid>
+      <w:tr>
+        <w:trPr>
+          <w:trHeight w:val="369" w:hRule="atLeast"/>
+          <w:cantSplit/>
+        </w:trPr>
+        <w:tc>
+          <w:tcPr>
+            <w:tcW w:type="dxa" w:w="2438"/>
+            <w:vAlign w:val="center"/>
+            <w:tcMar>
+              <w:top w:w="23" w:type="dxa"/>
+              <w:start w:w="125" w:type="dxa"/>
+              <w:bottom w:w="14" w:type="dxa"/>
+              <w:end w:w="28" w:type="dxa"/>
+            </w:tcMar>
+            <w:tcBorders>
+              <w:top w:val="nil"/>
+              <w:left w:val="nil"/>
+              <w:bottom w:val="single" w:sz="12" w:color="609EF3"/>
+              <w:right w:val="nil"/>
+              <w:insideH w:val="nil"/>
+              <w:insideV w:val="nil"/>
+            </w:tcBorders>
+            <w:shd w:fill="609EF3" w:val="clear"/>
+          </w:tcPr>
+          <w:p>
+            <w:pPr>
+              <w:keepNext w:val="0"/>
+              <w:keepLines/>
+              <w:widowControl w:val="0"/>
+              <w:spacing w:before="0" w:after="0" w:lineRule="exact" w:line="230"/>
+              <w:ind w:left="0" w:right="0"/>
+              <w:jc w:val="left"/>
+            </w:pPr>
+            <w:r>
+              <w:rPr>
+                <w:rFonts w:ascii="Arial" w:hAnsi="Arial" w:eastAsia="Microsoft YaHei" w:cs="Arial"/>
+                <w:b/>
+                <w:color w:val="FFFFFF"/>
+                <w:sz w:val="21"/>
+                <w:lang w:val="en-US" w:eastAsia="zh-CN"/>
+              </w:rPr>
+              <w:t>项目经历</w:t>
+            </w:r>
+          </w:p>
+        </w:tc>
+        <w:tc>
+          <w:tcPr>
+            <w:tcW w:type="dxa" w:w="8107"/>
+            <w:vAlign w:val="center"/>
+            <w:tcMar>
+              <w:top w:w="20" w:type="dxa"/>
+              <w:start w:w="37" w:type="dxa"/>
+              <w:bottom w:w="20" w:type="dxa"/>
+              <w:end w:w="37" w:type="dxa"/>
+            </w:tcMar>
+            <w:tcBorders>
+              <w:top w:val="nil"/>
+              <w:left w:val="nil"/>
+              <w:bottom w:val="single" w:sz="12" w:color="609EF3"/>
+              <w:right w:val="nil"/>
+              <w:insideH w:val="nil"/>
+              <w:insideV w:val="nil"/>
+            </w:tcBorders>
+          </w:tcPr>
+          <w:p>
+            <w:pPr>
+              <w:keepNext w:val="0"/>
+              <w:keepLines/>
+              <w:widowControl w:val="0"/>
+              <w:spacing w:before="0" w:after="0" w:lineRule="exact" w:line="20"/>
+              <w:ind w:left="0" w:right="0"/>
+              <w:jc w:val="left"/>
+            </w:pPr>
+          </w:p>
+        </w:tc>
+      </w:tr>
+    </w:tbl>
+    <w:tbl>
+      <w:tblPr>
+        <w:tblW w:type="auto" w:w="0"/>
+        <w:jc w:val="center"/>
+        <w:tblLayout w:type="fixed"/>
+        <w:tblLook w:firstColumn="1" w:firstRow="1" w:lastColumn="0" w:lastRow="0" w:noHBand="0" w:noVBand="1" w:val="04A0"/>
+      </w:tblPr>
+      <w:tblGrid>
+        <w:gridCol w:w="10035"/>
+        <w:gridCol w:w="510"/>
+      </w:tblGrid>
+      <w:tr>
+        <w:trPr>
+          <w:trHeight w:val="431" w:hRule="atLeast"/>
+          <w:cantSplit/>
+        </w:trPr>
+        <w:tc>
+          <w:tcPr>
+            <w:tcW w:type="dxa" w:w="10035"/>
+            <w:vAlign w:val="center"/>
+            <w:tcMar>
+              <w:top w:w="20" w:type="dxa"/>
+              <w:start w:w="37" w:type="dxa"/>
+              <w:bottom w:w="20" w:type="dxa"/>
+              <w:end w:w="37" w:type="dxa"/>
+            </w:tcMar>
+            <w:tcBorders>
+              <w:top w:val="nil"/>
+              <w:left w:val="nil"/>
+              <w:bottom w:val="nil"/>
+              <w:right w:val="nil"/>
+              <w:insideH w:val="nil"/>
+              <w:insideV w:val="nil"/>
+            </w:tcBorders>
+          </w:tcPr>
+          <w:p>
+            <w:pPr>
+              <w:keepNext w:val="0"/>
+              <w:keepLines/>
+              <w:widowControl w:val="0"/>
+              <w:spacing w:before="0" w:after="0" w:lineRule="exact" w:line="219"/>
+              <w:ind w:left="0" w:right="0"/>
+              <w:jc w:val="left"/>
+            </w:pPr>
+            <w:r>
+              <w:rPr>
+                <w:rFonts w:ascii="Arial" w:hAnsi="Arial" w:eastAsia="Microsoft YaHei" w:cs="Arial"/>
+                <w:b/>
+                <w:color w:val="333333"/>
+                <w:sz w:val="18"/>
+                <w:lang w:val="en-US" w:eastAsia="zh-CN"/>
+              </w:rPr>
+              <w:t>BOSS 直聘 Windows 桌面端自动化Skill</w:t>
+            </w:r>
+          </w:p>
+        </w:tc>
+        <w:tc>
+          <w:tcPr>
+            <w:tcW w:type="dxa" w:w="510"/>
+            <w:vAlign w:val="center"/>
+            <w:tcMar>
+              <w:top w:w="20" w:type="dxa"/>
+              <w:start w:w="37" w:type="dxa"/>
+              <w:bottom w:w="20" w:type="dxa"/>
+              <w:end w:w="37" w:type="dxa"/>
+            </w:tcMar>
+            <w:tcBorders>
+              <w:top w:val="nil"/>
+              <w:left w:val="nil"/>
+              <w:bottom w:val="nil"/>
+              <w:right w:val="nil"/>
+              <w:insideH w:val="nil"/>
+              <w:insideV w:val="nil"/>
+            </w:tcBorders>
+          </w:tcPr>
+          <w:p>
+            <w:pPr>
+              <w:keepLines/>
+              <w:widowControl w:val="0"/>
+              <w:spacing w:before="0" w:after="0" w:lineRule="atLeast" w:line="460"/>
+              <w:jc w:val="center"/>
+            </w:pPr>
+            <w:r>
+              <w:drawing>
+                <wp:inline xmlns:a="http://schemas.openxmlformats.org/drawingml/2006/main" xmlns:pic="http://schemas.openxmlformats.org/drawingml/2006/picture">
+                  <wp:extent cx="270000" cy="270000"/>
+                  <wp:docPr id="5" name="Picture 5"/>
+                  <wp:cNvGraphicFramePr>
+                    <a:graphicFrameLocks noChangeAspect="1"/>
+                  </wp:cNvGraphicFramePr>
+                  <a:graphic>
+                    <a:graphicData uri="http://schemas.openxmlformats.org/drawingml/2006/picture">
+                      <pic:pic>
+                        <pic:nvPicPr>
+                          <pic:cNvPr id="0" name="logo_boss_zhipin.png"/>
+                          <pic:cNvPicPr/>
+                        </pic:nvPicPr>
+                        <pic:blipFill>
+                          <a:blip r:embed="rId14"/>
+                          <a:stretch>
+                            <a:fillRect/>
+                          </a:stretch>
+                        </pic:blipFill>
+                        <pic:spPr>
+                          <a:xfrm>
+                            <a:off x="0" y="0"/>
+                            <a:ext cx="270000" cy="270000"/>
+                          </a:xfrm>
+                          <a:prstGeom prst="rect"/>
+                        </pic:spPr>
+                      </pic:pic>
+                    </a:graphicData>
+                  </a:graphic>
+                </wp:inline>
+              </w:drawing>
+            </w:r>
+          </w:p>
+        </w:tc>
+      </w:tr>
+    </w:tbl>
+    <w:p>
+      <w:pPr>
+        <w:keepNext/>
+        <w:keepLines/>
+        <w:widowControl w:val="0"/>
+        <w:spacing w:before="15" w:after="0" w:lineRule="exact" w:line="230"/>
+        <w:ind w:left="45" w:right="23"/>
+        <w:jc w:val="left"/>
+      </w:pPr>
+      <w:r>
+        <w:rPr>
+          <w:rFonts w:ascii="Arial" w:hAnsi="Arial" w:eastAsia="Microsoft YaHei" w:cs="Arial"/>
+          <w:b/>
+          <w:color w:val="333333"/>
+          <w:sz w:val="18"/>
+          <w:lang w:val="en-US" w:eastAsia="zh-CN"/>
+        </w:rPr>
+        <w:t>一、项目背景：</w:t>
+      </w:r>
+      <w:r>
+        <w:rPr>
+          <w:rFonts w:ascii="Arial" w:hAnsi="Arial" w:eastAsia="Microsoft YaHei" w:cs="Arial"/>
+          <w:b w:val="0"/>
+          <w:color w:val="555555"/>
+          <w:sz w:val="18"/>
+          <w:lang w:val="en-US" w:eastAsia="zh-CN"/>
+        </w:rPr>
+        <w:t>BOSS 直聘桌面端的岗位发布、候选人筛选、消息沟通和简历收取分散在多个页面，</w:t>
+      </w:r>
+      <w:r>
+        <w:rPr>
+          <w:rFonts w:ascii="Arial" w:hAnsi="Arial" w:eastAsia="Microsoft YaHei" w:cs="Arial"/>
+          <w:b/>
+          <w:color w:val="333333"/>
+          <w:sz w:val="18"/>
+          <w:lang w:val="en-US" w:eastAsia="zh-CN"/>
+        </w:rPr>
+        <w:t>存在大量重复操作</w:t>
+      </w:r>
+    </w:p>
+    <w:p>
+      <w:pPr>
+        <w:keepNext/>
+        <w:keepLines/>
+        <w:widowControl w:val="0"/>
+        <w:spacing w:before="15" w:after="0" w:lineRule="exact" w:line="230"/>
+        <w:ind w:left="45" w:right="23"/>
+        <w:jc w:val="left"/>
+      </w:pPr>
+      <w:r>
+        <w:rPr>
+          <w:rFonts w:ascii="Arial" w:hAnsi="Arial" w:eastAsia="Microsoft YaHei" w:cs="Arial"/>
+          <w:b/>
+          <w:color w:val="333333"/>
+          <w:sz w:val="18"/>
+          <w:lang w:val="en-US" w:eastAsia="zh-CN"/>
+        </w:rPr>
+        <w:t>二、项目执行：</w:t>
+      </w:r>
+      <w:r>
+        <w:rPr>
+          <w:rFonts w:ascii="Arial" w:hAnsi="Arial" w:eastAsia="Microsoft YaHei" w:cs="Arial"/>
+          <w:b w:val="0"/>
+          <w:color w:val="555555"/>
+          <w:sz w:val="18"/>
+          <w:lang w:val="en-US" w:eastAsia="zh-CN"/>
+        </w:rPr>
+        <w:t xml:space="preserve">基于 </w:t>
+      </w:r>
+      <w:r>
+        <w:rPr>
+          <w:rFonts w:ascii="Arial" w:hAnsi="Arial" w:eastAsia="Microsoft YaHei" w:cs="Arial"/>
+          <w:b/>
+          <w:color w:val="333333"/>
+          <w:sz w:val="18"/>
+          <w:lang w:val="en-US" w:eastAsia="zh-CN"/>
+        </w:rPr>
+        <w:t>Python、pywinauto 和 Windows UIA</w:t>
+      </w:r>
+      <w:r>
+        <w:rPr>
+          <w:rFonts w:ascii="Arial" w:hAnsi="Arial" w:eastAsia="Microsoft YaHei" w:cs="Arial"/>
+          <w:b w:val="0"/>
+          <w:color w:val="555555"/>
+          <w:sz w:val="18"/>
+          <w:lang w:val="en-US" w:eastAsia="zh-CN"/>
+        </w:rPr>
+        <w:t xml:space="preserve"> 实现桌面端语义化自动化：支持实习、社招、校招和兼职岗位发布，基于 JD 对候选人进行证据化初评；支持批量打招呼、文档依据回复、批量及定向消息，以及平台或普通消息索要简历、附件确认和 PDF/DOCX 下载校验。</w:t>
+      </w:r>
+    </w:p>
+    <w:p>
+      <w:pPr>
+        <w:keepNext/>
+        <w:keepLines/>
+        <w:widowControl w:val="0"/>
+        <w:spacing w:before="15" w:after="30" w:lineRule="exact" w:line="230"/>
+        <w:ind w:left="45" w:right="23"/>
+        <w:jc w:val="left"/>
+      </w:pPr>
+      <w:r>
+        <w:rPr>
+          <w:rFonts w:ascii="Arial" w:hAnsi="Arial" w:eastAsia="Microsoft YaHei" w:cs="Arial"/>
+          <w:b/>
+          <w:color w:val="333333"/>
+          <w:sz w:val="18"/>
+          <w:lang w:val="en-US" w:eastAsia="zh-CN"/>
+        </w:rPr>
+        <w:t>三、项目结果：</w:t>
+      </w:r>
+      <w:r>
+        <w:rPr>
+          <w:rFonts w:ascii="Arial" w:hAnsi="Arial" w:eastAsia="Microsoft YaHei" w:cs="Arial"/>
+          <w:b w:val="0"/>
+          <w:color w:val="555555"/>
+          <w:sz w:val="18"/>
+          <w:lang w:val="en-US" w:eastAsia="zh-CN"/>
+        </w:rPr>
+        <w:t>完成并</w:t>
+      </w:r>
+      <w:r>
+        <w:rPr>
+          <w:rFonts w:ascii="Arial" w:hAnsi="Arial" w:eastAsia="Microsoft YaHei" w:cs="Arial"/>
+          <w:b/>
+          <w:color w:val="333333"/>
+          <w:sz w:val="18"/>
+          <w:lang w:val="en-US" w:eastAsia="zh-CN"/>
+        </w:rPr>
+        <w:t>开源</w:t>
+      </w:r>
+      <w:r>
+        <w:rPr>
+          <w:rFonts w:ascii="Arial" w:hAnsi="Arial" w:eastAsia="Microsoft YaHei" w:cs="Arial"/>
+          <w:b w:val="0"/>
+          <w:color w:val="555555"/>
+          <w:sz w:val="18"/>
+          <w:lang w:val="en-US" w:eastAsia="zh-CN"/>
+        </w:rPr>
+        <w:t xml:space="preserve"> 4 个可组合的招聘自动化 Skill，形成“岗位发布 → 候选人初筛 → 候选人沟通 → 简历收取”的标准化流程；并提供相关</w:t>
+      </w:r>
+      <w:r>
+        <w:rPr>
+          <w:rFonts w:ascii="Arial" w:hAnsi="Arial" w:eastAsia="Microsoft YaHei" w:cs="Arial"/>
+          <w:b/>
+          <w:color w:val="333333"/>
+          <w:sz w:val="18"/>
+          <w:lang w:val="en-US" w:eastAsia="zh-CN"/>
+        </w:rPr>
+        <w:t>真实执行的示例</w:t>
+      </w:r>
+    </w:p>
+    <w:tbl>
+      <w:tblPr>
+        <w:tblW w:type="auto" w:w="0"/>
+        <w:jc w:val="center"/>
+        <w:tblLayout w:type="fixed"/>
+        <w:tblLook w:firstColumn="1" w:firstRow="1" w:lastColumn="0" w:lastRow="0" w:noHBand="0" w:noVBand="1" w:val="04A0"/>
+      </w:tblPr>
+      <w:tblGrid>
+        <w:gridCol w:w="2438"/>
+        <w:gridCol w:w="8107"/>
+      </w:tblGrid>
+      <w:tr>
+        <w:trPr>
+          <w:trHeight w:val="369" w:hRule="atLeast"/>
+          <w:cantSplit/>
+        </w:trPr>
+        <w:tc>
+          <w:tcPr>
+            <w:tcW w:type="dxa" w:w="2438"/>
+            <w:vAlign w:val="center"/>
+            <w:tcMar>
+              <w:top w:w="23" w:type="dxa"/>
+              <w:start w:w="125" w:type="dxa"/>
+              <w:bottom w:w="14" w:type="dxa"/>
+              <w:end w:w="28" w:type="dxa"/>
+            </w:tcMar>
+            <w:tcBorders>
+              <w:top w:val="nil"/>
+              <w:left w:val="nil"/>
+              <w:bottom w:val="single" w:sz="12" w:color="609EF3"/>
+              <w:right w:val="nil"/>
+              <w:insideH w:val="nil"/>
+              <w:insideV w:val="nil"/>
+            </w:tcBorders>
+            <w:shd w:fill="609EF3" w:val="clear"/>
+          </w:tcPr>
+          <w:p>
+            <w:pPr>
+              <w:keepNext w:val="0"/>
+              <w:keepLines/>
+              <w:widowControl w:val="0"/>
+              <w:spacing w:before="0" w:after="0" w:lineRule="exact" w:line="230"/>
+              <w:ind w:left="0" w:right="0"/>
+              <w:jc w:val="left"/>
+            </w:pPr>
+            <w:r>
+              <w:rPr>
+                <w:rFonts w:ascii="Arial" w:hAnsi="Arial" w:eastAsia="Microsoft YaHei" w:cs="Arial"/>
+                <w:b/>
+                <w:color w:val="FFFFFF"/>
+                <w:sz w:val="21"/>
+                <w:lang w:val="en-US" w:eastAsia="zh-CN"/>
+              </w:rPr>
+              <w:t>教育背景</w:t>
+            </w:r>
+          </w:p>
+        </w:tc>
+        <w:tc>
+          <w:tcPr>
+            <w:tcW w:type="dxa" w:w="8107"/>
+            <w:vAlign w:val="center"/>
+            <w:tcMar>
+              <w:top w:w="20" w:type="dxa"/>
+              <w:start w:w="37" w:type="dxa"/>
+              <w:bottom w:w="20" w:type="dxa"/>
+              <w:end w:w="37" w:type="dxa"/>
+            </w:tcMar>
+            <w:tcBorders>
+              <w:top w:val="nil"/>
+              <w:left w:val="nil"/>
+              <w:bottom w:val="single" w:sz="12" w:color="609EF3"/>
+              <w:right w:val="nil"/>
+              <w:insideH w:val="nil"/>
+              <w:insideV w:val="nil"/>
+            </w:tcBorders>
+          </w:tcPr>
+          <w:p>
+            <w:pPr>
+              <w:keepNext w:val="0"/>
+              <w:keepLines/>
+              <w:widowControl w:val="0"/>
+              <w:spacing w:before="0" w:after="0" w:lineRule="exact" w:line="20"/>
+              <w:ind w:left="0" w:right="0"/>
+              <w:jc w:val="left"/>
+            </w:pPr>
+          </w:p>
+        </w:tc>
+      </w:tr>
+    </w:tbl>
+    <w:tbl>
+      <w:tblPr>
+        <w:tblW w:type="auto" w:w="0"/>
+        <w:jc w:val="center"/>
+        <w:tblLayout w:type="fixed"/>
+        <w:tblLook w:firstColumn="1" w:firstRow="1" w:lastColumn="0" w:lastRow="0" w:noHBand="0" w:noVBand="1" w:val="04A0"/>
+      </w:tblPr>
+      <w:tblGrid>
+        <w:gridCol w:w="2438"/>
+        <w:gridCol w:w="5669"/>
+        <w:gridCol w:w="2438"/>
+      </w:tblGrid>
+      <w:tr>
+        <w:trPr>
+          <w:trHeight w:val="454" w:hRule="atLeast"/>
+          <w:cantSplit/>
+        </w:trPr>
+        <w:tc>
+          <w:tcPr>
+            <w:tcW w:type="dxa" w:w="2438"/>
+            <w:vAlign w:val="center"/>
+            <w:tcMar>
+              <w:top w:w="20" w:type="dxa"/>
+              <w:start w:w="37" w:type="dxa"/>
+              <w:bottom w:w="20" w:type="dxa"/>
+              <w:end w:w="37" w:type="dxa"/>
+            </w:tcMar>
+            <w:tcBorders>
+              <w:top w:val="nil"/>
+              <w:left w:val="nil"/>
+              <w:bottom w:val="nil"/>
+              <w:right w:val="nil"/>
+              <w:insideH w:val="nil"/>
+              <w:insideV w:val="nil"/>
+            </w:tcBorders>
+          </w:tcPr>
+          <w:p>
+            <w:pPr>
+              <w:keepNext w:val="0"/>
+              <w:keepLines/>
+              <w:widowControl w:val="0"/>
+              <w:spacing w:before="0" w:after="0" w:lineRule="exact" w:line="212"/>
+              <w:ind w:left="0" w:right="0"/>
+              <w:jc w:val="left"/>
+            </w:pPr>
+            <w:r>
+              <w:rPr>
+                <w:rFonts w:ascii="Arial" w:hAnsi="Arial" w:eastAsia="Microsoft YaHei" w:cs="Arial"/>
+                <w:b w:val="0"/>
+                <w:color w:val="555555"/>
+                <w:sz w:val="18"/>
+                <w:lang w:val="en-US" w:eastAsia="zh-CN"/>
+              </w:rPr>
+              <w:t>2023-09 ~ 2027-06</w:t>
+            </w:r>
+          </w:p>
+        </w:tc>
+        <w:tc>
+          <w:tcPr>
+            <w:tcW w:type="dxa" w:w="5669"/>
+            <w:vAlign w:val="center"/>
+            <w:tcMar>
+              <w:top w:w="20" w:type="dxa"/>
+              <w:start w:w="37" w:type="dxa"/>
+              <w:bottom w:w="20" w:type="dxa"/>
+              <w:end w:w="37" w:type="dxa"/>
+            </w:tcMar>
+            <w:tcBorders>
+              <w:top w:val="nil"/>
+              <w:left w:val="nil"/>
+              <w:bottom w:val="nil"/>
+              <w:right w:val="nil"/>
+              <w:insideH w:val="nil"/>
+              <w:insideV w:val="nil"/>
+            </w:tcBorders>
+          </w:tcPr>
+          <w:p>
+            <w:pPr>
+              <w:keepNext w:val="0"/>
+              <w:keepLines/>
+              <w:widowControl w:val="0"/>
+              <w:spacing w:before="0" w:after="0" w:lineRule="exact" w:line="219"/>
+              <w:ind w:left="0" w:right="0"/>
+              <w:jc w:val="center"/>
+            </w:pPr>
+            <w:r>
+              <w:rPr>
+                <w:rFonts w:ascii="Arial" w:hAnsi="Arial" w:eastAsia="Microsoft YaHei" w:cs="Arial"/>
+                <w:b/>
+                <w:color w:val="333333"/>
+                <w:sz w:val="18"/>
+                <w:lang w:val="en-US" w:eastAsia="zh-CN"/>
+              </w:rPr>
+              <w:t>上海立信会计金融学院（公办本科）</w:t>
+            </w:r>
+          </w:p>
+        </w:tc>
+        <w:tc>
+          <w:tcPr>
+            <w:tcW w:type="dxa" w:w="2438"/>
+            <w:vAlign w:val="center"/>
+            <w:tcMar>
+              <w:top w:w="20" w:type="dxa"/>
+              <w:start w:w="37" w:type="dxa"/>
+              <w:bottom w:w="20" w:type="dxa"/>
+              <w:end w:w="37" w:type="dxa"/>
+            </w:tcMar>
+            <w:tcBorders>
+              <w:top w:val="nil"/>
+              <w:left w:val="nil"/>
+              <w:bottom w:val="nil"/>
+              <w:right w:val="nil"/>
+              <w:insideH w:val="nil"/>
+              <w:insideV w:val="nil"/>
+            </w:tcBorders>
+          </w:tcPr>
+          <w:p>
+            <w:pPr>
+              <w:keepNext w:val="0"/>
+              <w:keepLines/>
+              <w:widowControl w:val="0"/>
+              <w:spacing w:before="0" w:after="0" w:lineRule="exact" w:line="215"/>
+              <w:ind w:left="0" w:right="0"/>
+              <w:jc w:val="right"/>
+            </w:pPr>
+            <w:r>
+              <w:rPr>
+                <w:rFonts w:ascii="Arial" w:hAnsi="Arial" w:eastAsia="Microsoft YaHei" w:cs="Arial"/>
+                <w:b/>
+                <w:color w:val="333333"/>
+                <w:sz w:val="18"/>
+                <w:lang w:val="en-US" w:eastAsia="zh-CN"/>
+              </w:rPr>
+              <w:t>智能科学与技术</w:t>
+            </w:r>
+          </w:p>
+        </w:tc>
+      </w:tr>
+    </w:tbl>
+    <w:tbl>
+      <w:tblPr>
+        <w:tblW w:type="auto" w:w="0"/>
+        <w:jc w:val="center"/>
+        <w:tblLayout w:type="fixed"/>
+        <w:tblLook w:firstColumn="1" w:firstRow="1" w:lastColumn="0" w:lastRow="0" w:noHBand="0" w:noVBand="1" w:val="04A0"/>
+      </w:tblPr>
+      <w:tblGrid>
+        <w:gridCol w:w="2438"/>
+        <w:gridCol w:w="8107"/>
+      </w:tblGrid>
+      <w:tr>
+        <w:trPr>
+          <w:trHeight w:val="369" w:hRule="atLeast"/>
+          <w:cantSplit/>
+        </w:trPr>
+        <w:tc>
+          <w:tcPr>
+            <w:tcW w:type="dxa" w:w="2438"/>
+            <w:vAlign w:val="center"/>
+            <w:tcMar>
+              <w:top w:w="23" w:type="dxa"/>
+              <w:start w:w="125" w:type="dxa"/>
+              <w:bottom w:w="14" w:type="dxa"/>
+              <w:end w:w="28" w:type="dxa"/>
+            </w:tcMar>
+            <w:tcBorders>
+              <w:top w:val="nil"/>
+              <w:left w:val="nil"/>
+              <w:bottom w:val="single" w:sz="12" w:color="609EF3"/>
+              <w:right w:val="nil"/>
+              <w:insideH w:val="nil"/>
+              <w:insideV w:val="nil"/>
+            </w:tcBorders>
+            <w:shd w:fill="609EF3" w:val="clear"/>
+          </w:tcPr>
+          <w:p>
+            <w:pPr>
+              <w:keepNext w:val="0"/>
+              <w:keepLines/>
+              <w:widowControl w:val="0"/>
+              <w:spacing w:before="0" w:after="0" w:lineRule="exact" w:line="230"/>
+              <w:ind w:left="0" w:right="0"/>
+              <w:jc w:val="left"/>
+            </w:pPr>
+            <w:r>
+              <w:rPr>
+                <w:rFonts w:ascii="Arial" w:hAnsi="Arial" w:eastAsia="Microsoft YaHei" w:cs="Arial"/>
+                <w:b/>
+                <w:color w:val="FFFFFF"/>
+                <w:sz w:val="21"/>
+                <w:lang w:val="en-US" w:eastAsia="zh-CN"/>
+              </w:rPr>
+              <w:t>技能特长</w:t>
+            </w:r>
+          </w:p>
+        </w:tc>
+        <w:tc>
+          <w:tcPr>
+            <w:tcW w:type="dxa" w:w="8107"/>
+            <w:vAlign w:val="center"/>
+            <w:tcMar>
+              <w:top w:w="20" w:type="dxa"/>
+              <w:start w:w="37" w:type="dxa"/>
+              <w:bottom w:w="20" w:type="dxa"/>
+              <w:end w:w="37" w:type="dxa"/>
+            </w:tcMar>
+            <w:tcBorders>
+              <w:top w:val="nil"/>
+              <w:left w:val="nil"/>
+              <w:bottom w:val="single" w:sz="12" w:color="609EF3"/>
+              <w:right w:val="nil"/>
+              <w:insideH w:val="nil"/>
+              <w:insideV w:val="nil"/>
+            </w:tcBorders>
+          </w:tcPr>
+          <w:p>
+            <w:pPr>
+              <w:keepNext w:val="0"/>
+              <w:keepLines/>
+              <w:widowControl w:val="0"/>
+              <w:spacing w:before="0" w:after="0" w:lineRule="exact" w:line="20"/>
+              <w:ind w:left="0" w:right="0"/>
+              <w:jc w:val="left"/>
+            </w:pPr>
+          </w:p>
+        </w:tc>
+      </w:tr>
+    </w:tbl>
+    <w:p>
+      <w:pPr>
+        <w:keepNext w:val="0"/>
+        <w:keepLines/>
+        <w:widowControl w:val="0"/>
+        <w:spacing w:before="0" w:after="0" w:lineRule="exact" w:line="224"/>
+        <w:ind w:left="45" w:right="23"/>
+        <w:jc w:val="left"/>
+      </w:pPr>
+      <w:r>
+        <w:rPr>
+          <w:rFonts w:ascii="Arial" w:hAnsi="Arial" w:eastAsia="Microsoft YaHei" w:cs="Arial"/>
+          <w:b/>
+          <w:color w:val="333333"/>
+          <w:sz w:val="18"/>
+          <w:lang w:val="en-US" w:eastAsia="zh-CN"/>
+        </w:rPr>
+        <w:t>1.FDE能力：深入客户现场</w:t>
+      </w:r>
+      <w:r>
+        <w:rPr>
+          <w:rFonts w:ascii="Arial" w:hAnsi="Arial" w:eastAsia="Microsoft YaHei" w:cs="Arial"/>
+          <w:b w:val="0"/>
+          <w:color w:val="555555"/>
+          <w:sz w:val="18"/>
+          <w:lang w:val="en-US" w:eastAsia="zh-CN"/>
+        </w:rPr>
+        <w:t>，把AI技术转化为客户可量化的业务价值，打通AI落地</w:t>
+      </w:r>
+    </w:p>
+    <w:p>
+      <w:pPr>
+        <w:keepNext w:val="0"/>
+        <w:keepLines/>
+        <w:widowControl w:val="0"/>
+        <w:spacing w:before="0" w:after="0" w:lineRule="exact" w:line="224"/>
+        <w:ind w:left="45" w:right="23"/>
+        <w:jc w:val="left"/>
+      </w:pPr>
+      <w:r>
+        <w:rPr>
+          <w:rFonts w:ascii="Arial" w:hAnsi="Arial" w:eastAsia="Microsoft YaHei" w:cs="Arial"/>
+          <w:b/>
+          <w:color w:val="333333"/>
+          <w:sz w:val="18"/>
+          <w:lang w:val="en-US" w:eastAsia="zh-CN"/>
+        </w:rPr>
+        <w:t>2.AI动态关注与效率提升：</w:t>
+      </w:r>
+      <w:r>
+        <w:rPr>
+          <w:rFonts w:ascii="Arial" w:hAnsi="Arial" w:eastAsia="Microsoft YaHei" w:cs="Arial"/>
+          <w:b w:val="0"/>
+          <w:color w:val="555555"/>
+          <w:sz w:val="18"/>
+          <w:lang w:val="en-US" w:eastAsia="zh-CN"/>
+        </w:rPr>
+        <w:t>持续关注</w:t>
+      </w:r>
+      <w:r>
+        <w:rPr>
+          <w:rFonts w:ascii="Arial" w:hAnsi="Arial" w:eastAsia="Microsoft YaHei" w:cs="Arial"/>
+          <w:b/>
+          <w:color w:val="333333"/>
+          <w:sz w:val="18"/>
+          <w:lang w:val="en-US" w:eastAsia="zh-CN"/>
+        </w:rPr>
+        <w:t>AI工具</w:t>
+      </w:r>
+      <w:r>
+        <w:rPr>
+          <w:rFonts w:ascii="Arial" w:hAnsi="Arial" w:eastAsia="Microsoft YaHei" w:cs="Arial"/>
+          <w:b w:val="0"/>
+          <w:color w:val="555555"/>
+          <w:sz w:val="18"/>
+          <w:lang w:val="en-US" w:eastAsia="zh-CN"/>
+        </w:rPr>
+        <w:t>(AI 编程， AI大模型，智能体平台）的技术演进与产品形态，为自家公司产品赋能</w:t>
+      </w:r>
+    </w:p>
+    <w:p>
+      <w:pPr>
+        <w:keepNext w:val="0"/>
+        <w:keepLines/>
+        <w:widowControl w:val="0"/>
+        <w:spacing w:before="0" w:after="0" w:lineRule="exact" w:line="224"/>
+        <w:ind w:left="45" w:right="23"/>
+        <w:jc w:val="left"/>
+      </w:pPr>
+      <w:r>
+        <w:rPr>
+          <w:rFonts w:ascii="Arial" w:hAnsi="Arial" w:eastAsia="Microsoft YaHei" w:cs="Arial"/>
+          <w:b/>
+          <w:color w:val="333333"/>
+          <w:sz w:val="18"/>
+          <w:lang w:val="en-US" w:eastAsia="zh-CN"/>
+        </w:rPr>
+        <w:t>3.Vibe Coding 能力:</w:t>
+      </w:r>
+      <w:r>
+        <w:rPr>
+          <w:rFonts w:ascii="Arial" w:hAnsi="Arial" w:eastAsia="Microsoft YaHei" w:cs="Arial"/>
+          <w:b w:val="0"/>
+          <w:color w:val="555555"/>
+          <w:sz w:val="18"/>
+          <w:lang w:val="en-US" w:eastAsia="zh-CN"/>
+        </w:rPr>
+        <w:t xml:space="preserve"> 具备 Vibe Coding 能力，可通过自然语言快速搭建 </w:t>
+      </w:r>
+      <w:r>
+        <w:rPr>
+          <w:rFonts w:ascii="Arial" w:hAnsi="Arial" w:eastAsia="Microsoft YaHei" w:cs="Arial"/>
+          <w:b/>
+          <w:color w:val="333333"/>
+          <w:sz w:val="18"/>
+          <w:lang w:val="en-US" w:eastAsia="zh-CN"/>
+        </w:rPr>
+        <w:t>AI 功能原型和网站</w:t>
+      </w:r>
+    </w:p>
+    <w:p>
+      <w:pPr>
+        <w:keepNext w:val="0"/>
+        <w:keepLines/>
+        <w:widowControl w:val="0"/>
+        <w:spacing w:before="0" w:after="30" w:lineRule="exact" w:line="224"/>
+        <w:ind w:left="45" w:right="23"/>
+        <w:jc w:val="left"/>
+      </w:pPr>
+      <w:r>
+        <w:rPr>
+          <w:rFonts w:ascii="Arial" w:hAnsi="Arial" w:eastAsia="Microsoft YaHei" w:cs="Arial"/>
+          <w:b/>
+          <w:color w:val="333333"/>
+          <w:sz w:val="18"/>
+          <w:lang w:val="en-US" w:eastAsia="zh-CN"/>
+        </w:rPr>
+        <w:t>4.英语能力</w:t>
+      </w:r>
+      <w:r>
+        <w:rPr>
+          <w:rFonts w:ascii="Arial" w:hAnsi="Arial" w:eastAsia="Microsoft YaHei" w:cs="Arial"/>
+          <w:b w:val="0"/>
+          <w:color w:val="555555"/>
+          <w:sz w:val="18"/>
+          <w:lang w:val="en-US" w:eastAsia="zh-CN"/>
+        </w:rPr>
+        <w:t>：通过大学</w:t>
+      </w:r>
+      <w:r>
+        <w:rPr>
+          <w:rFonts w:ascii="Arial" w:hAnsi="Arial" w:eastAsia="Microsoft YaHei" w:cs="Arial"/>
+          <w:b/>
+          <w:color w:val="333333"/>
+          <w:sz w:val="18"/>
+          <w:lang w:val="en-US" w:eastAsia="zh-CN"/>
+        </w:rPr>
+        <w:t>英语六级</w:t>
+      </w:r>
+      <w:r>
+        <w:rPr>
+          <w:rFonts w:ascii="Arial" w:hAnsi="Arial" w:eastAsia="Microsoft YaHei" w:cs="Arial"/>
+          <w:b w:val="0"/>
+          <w:color w:val="555555"/>
+          <w:sz w:val="18"/>
+          <w:lang w:val="en-US" w:eastAsia="zh-CN"/>
+        </w:rPr>
+        <w:t>考试，可无障碍阅读英文文档</w:t>
       </w:r>
     </w:p>
     <w:sectPr>
       <w:pgSz w:w="11906" w:h="16838"/>
-      <w:pgMar w:top="57" w:right="57" w:bottom="57" w:left="57" w:header="0" w:footer="0" w:gutter="0"/>
+      <w:pgMar w:top="510" w:right="680" w:bottom="510" w:left="680" w:header="0" w:footer="0" w:gutter="0"/>
       <w:cols w:space="720"/>
       <w:docGrid w:linePitch="360"/>
     </w:sectPr>
@@ -416,6 +3489,13 @@
     <w:name w:val="Normal"/>
     <w:qFormat/>
     <w:rsid w:val="00FC693F"/>
+    <w:pPr>
+      <w:spacing w:before="0" w:after="0" w:lineRule="exact" w:line="224"/>
+    </w:pPr>
+    <w:rPr>
+      <w:rFonts w:ascii="Arial" w:hAnsi="Arial" w:eastAsia="Microsoft YaHei"/>
+      <w:sz w:val="18"/>
+    </w:rPr>
   </w:style>
   <w:style w:type="paragraph" w:styleId="Header">
     <w:name w:val="header"/>

</xml_diff>